<commit_message>
Rebuild CV DOCX: section order fixed, publications with sub-headers and bolded name, all content synced
</commit_message>
<xml_diff>
--- a/docs/rifqi-cv-260624.docx
+++ b/docs/rifqi-cv-260624.docx
@@ -15,7 +15,7 @@
           <w:sz w:val="36"/>
           <w:szCs w:val="36"/>
         </w:rPr>
-        <w:t xml:space="preserve">M. RIFQI DZAKY AZHAD</w:t>
+        <w:t xml:space="preserve">M. Rifqi Dzaky Azhad</w:t>
       </w:r>
     </w:p>
     <w:p>
@@ -37,7 +37,7 @@
         <w:pBdr>
           <w:bottom w:val="single" w:color="000000" w:sz="4" w:space="2"/>
         </w:pBdr>
-        <w:spacing w:after="80" w:before="180"/>
+        <w:spacing w:after="80" w:before="200"/>
       </w:pPr>
       <w:r>
         <w:rPr>
@@ -61,7 +61,7 @@
           <w:sz w:val="20"/>
           <w:szCs w:val="20"/>
         </w:rPr>
-        <w:t xml:space="preserve">Medical imaging ML researcher at Telkom University, GPA 4.0/4.0. Built a bone scan diagnostic pipeline achieving patient-level AUC 0.956, above EXINI and BONENAVI (two commercial systems in clinical use). First-authored a conference paper published in IEEE Xplore. ML system in production on commercial mining fleet dashcams.</w:t>
+        <w:t xml:space="preserve">Medical imaging ML researcher at Telkom University, GPA 4.0/4.0. Built a bone scan diagnostic pipeline achieving patient-level AUC 0.956, above EXINI and BONENAVI (two commercial systems in clinical use). First-authored an IEEE Xplore conference paper on bird species identification. One ML model running in production on commercial mining fleet dashcams.</w:t>
       </w:r>
     </w:p>
     <w:p>
@@ -69,7 +69,7 @@
         <w:pBdr>
           <w:bottom w:val="single" w:color="000000" w:sz="4" w:space="2"/>
         </w:pBdr>
-        <w:spacing w:after="80" w:before="180"/>
+        <w:spacing w:after="80" w:before="200"/>
       </w:pPr>
       <w:r>
         <w:rPr>
@@ -80,7 +80,7 @@
           <w:sz w:val="22"/>
           <w:szCs w:val="22"/>
         </w:rPr>
-        <w:t xml:space="preserve">Education</w:t>
+        <w:t xml:space="preserve">Experience</w:t>
       </w:r>
     </w:p>
     <w:p>
@@ -98,47 +98,64 @@
           <w:sz w:val="20"/>
           <w:szCs w:val="20"/>
         </w:rPr>
-        <w:t xml:space="preserve">S1 Informatika (Bachelor of Informatics)</w:t>
-      </w:r>
-      <w:r>
-        <w:rPr>
-          <w:rFonts w:ascii="Calibri" w:cs="Calibri" w:eastAsia="Calibri" w:hAnsi="Calibri"/>
-          <w:sz w:val="20"/>
-          <w:szCs w:val="20"/>
-        </w:rPr>
-        <w:t xml:space="preserve">	May 2023 – Expected May 2027</w:t>
-      </w:r>
-    </w:p>
-    <w:p>
-      <w:pPr>
-        <w:spacing w:after="60" w:before="0"/>
-      </w:pPr>
-      <w:r>
-        <w:rPr>
-          <w:rFonts w:ascii="Calibri" w:cs="Calibri" w:eastAsia="Calibri" w:hAnsi="Calibri"/>
-          <w:sz w:val="20"/>
-          <w:szCs w:val="20"/>
-        </w:rPr>
-        <w:t xml:space="preserve">Telkom University  ·  GPA 4.0/4.0</w:t>
-      </w:r>
-    </w:p>
-    <w:p>
-      <w:pPr>
-        <w:pBdr>
-          <w:bottom w:val="single" w:color="000000" w:sz="4" w:space="2"/>
-        </w:pBdr>
-        <w:spacing w:after="80" w:before="180"/>
-      </w:pPr>
-      <w:r>
-        <w:rPr>
-          <w:rFonts w:ascii="Calibri" w:cs="Calibri" w:eastAsia="Calibri" w:hAnsi="Calibri"/>
-          <w:b/>
-          <w:bCs/>
-          <w:caps/>
-          <w:sz w:val="22"/>
-          <w:szCs w:val="22"/>
-        </w:rPr>
-        <w:t xml:space="preserve">Experience</w:t>
+        <w:t xml:space="preserve">Research Assistant, Multi-Task CXR Foundation Model</w:t>
+      </w:r>
+      <w:r>
+        <w:rPr>
+          <w:rFonts w:ascii="Calibri" w:cs="Calibri" w:eastAsia="Calibri" w:hAnsi="Calibri"/>
+          <w:sz w:val="20"/>
+          <w:szCs w:val="20"/>
+        </w:rPr>
+        <w:t xml:space="preserve">	2025 – Present</w:t>
+      </w:r>
+    </w:p>
+    <w:p>
+      <w:pPr>
+        <w:spacing w:after="40" w:before="0"/>
+      </w:pPr>
+      <w:r>
+        <w:rPr>
+          <w:rFonts w:ascii="Calibri" w:cs="Calibri" w:eastAsia="Calibri" w:hAnsi="Calibri"/>
+          <w:i/>
+          <w:iCs/>
+          <w:sz w:val="20"/>
+          <w:szCs w:val="20"/>
+        </w:rPr>
+        <w:t xml:space="preserve">Telkom University</w:t>
+      </w:r>
+    </w:p>
+    <w:p>
+      <w:pPr>
+        <w:pStyle w:val="ListParagraph"/>
+        <w:numPr>
+          <w:ilvl w:val="0"/>
+          <w:numId w:val="2"/>
+        </w:numPr>
+      </w:pPr>
+      <w:r>
+        <w:rPr>
+          <w:rFonts w:ascii="Calibri" w:cs="Calibri" w:eastAsia="Calibri" w:hAnsi="Calibri"/>
+          <w:sz w:val="20"/>
+          <w:szCs w:val="20"/>
+        </w:rPr>
+        <w:t xml:space="preserve">Developing a 20+ disease CXR pathology classifier with hierarchical classification and fallback uncertainty estimation, aligned to Indonesian healthcare organization disease standards.</w:t>
+      </w:r>
+    </w:p>
+    <w:p>
+      <w:pPr>
+        <w:pStyle w:val="ListParagraph"/>
+        <w:numPr>
+          <w:ilvl w:val="0"/>
+          <w:numId w:val="2"/>
+        </w:numPr>
+      </w:pPr>
+      <w:r>
+        <w:rPr>
+          <w:rFonts w:ascii="Calibri" w:cs="Calibri" w:eastAsia="Calibri" w:hAnsi="Calibri"/>
+          <w:sz w:val="20"/>
+          <w:szCs w:val="20"/>
+        </w:rPr>
+        <w:t xml:space="preserve">Deployed pathology classifier and organ segmentation as shared microservices consumed by the team's web and desktop apps through a single API.</w:t>
       </w:r>
     </w:p>
     <w:p>
@@ -156,15 +173,15 @@
           <w:sz w:val="20"/>
           <w:szCs w:val="20"/>
         </w:rPr>
-        <w:t xml:space="preserve">Research Assistant, Multi-Task CXR Foundation Model</w:t>
-      </w:r>
-      <w:r>
-        <w:rPr>
-          <w:rFonts w:ascii="Calibri" w:cs="Calibri" w:eastAsia="Calibri" w:hAnsi="Calibri"/>
-          <w:sz w:val="20"/>
-          <w:szCs w:val="20"/>
-        </w:rPr>
-        <w:t xml:space="preserve">	2025 – Present</w:t>
+        <w:t xml:space="preserve">AI Engineer Intern</w:t>
+      </w:r>
+      <w:r>
+        <w:rPr>
+          <w:rFonts w:ascii="Calibri" w:cs="Calibri" w:eastAsia="Calibri" w:hAnsi="Calibri"/>
+          <w:sz w:val="20"/>
+          <w:szCs w:val="20"/>
+        </w:rPr>
+        <w:t xml:space="preserve">	March 2025 – Present</w:t>
       </w:r>
     </w:p>
     <w:p>
@@ -179,41 +196,41 @@
           <w:sz w:val="20"/>
           <w:szCs w:val="20"/>
         </w:rPr>
-        <w:t xml:space="preserve">Telkom University</w:t>
-      </w:r>
-    </w:p>
-    <w:p>
-      <w:pPr>
-        <w:pStyle w:val="ListParagraph"/>
-        <w:numPr>
-          <w:ilvl w:val="0"/>
-          <w:numId w:val="2"/>
-        </w:numPr>
-      </w:pPr>
-      <w:r>
-        <w:rPr>
-          <w:rFonts w:ascii="Calibri" w:cs="Calibri" w:eastAsia="Calibri" w:hAnsi="Calibri"/>
-          <w:sz w:val="20"/>
-          <w:szCs w:val="20"/>
-        </w:rPr>
-        <w:t xml:space="preserve">Developing a 20+ disease CXR pathology classifier with hierarchical classification and fallback uncertainty estimation, aligned to Indonesian healthcare organization disease standards.</w:t>
-      </w:r>
-    </w:p>
-    <w:p>
-      <w:pPr>
-        <w:pStyle w:val="ListParagraph"/>
-        <w:numPr>
-          <w:ilvl w:val="0"/>
-          <w:numId w:val="2"/>
-        </w:numPr>
-      </w:pPr>
-      <w:r>
-        <w:rPr>
-          <w:rFonts w:ascii="Calibri" w:cs="Calibri" w:eastAsia="Calibri" w:hAnsi="Calibri"/>
-          <w:sz w:val="20"/>
-          <w:szCs w:val="20"/>
-        </w:rPr>
-        <w:t xml:space="preserve">Deployed pathology classifier and organ segmentation as shared microservices consumed by the team’s web and desktop apps through a single API.</w:t>
+        <w:t xml:space="preserve">Bandung Techno Park · Trans Track</w:t>
+      </w:r>
+    </w:p>
+    <w:p>
+      <w:pPr>
+        <w:pStyle w:val="ListParagraph"/>
+        <w:numPr>
+          <w:ilvl w:val="0"/>
+          <w:numId w:val="2"/>
+        </w:numPr>
+      </w:pPr>
+      <w:r>
+        <w:rPr>
+          <w:rFonts w:ascii="Calibri" w:cs="Calibri" w:eastAsia="Calibri" w:hAnsi="Calibri"/>
+          <w:sz w:val="20"/>
+          <w:szCs w:val="20"/>
+        </w:rPr>
+        <w:t xml:space="preserve">Designed a facial landmark sequence model from scratch on real dashcam footage from active mining fleet drivers at BIB, PAMA MTBU, and SIS. Macro F1 0.78, an 11% gain over the company's production model.</w:t>
+      </w:r>
+    </w:p>
+    <w:p>
+      <w:pPr>
+        <w:pStyle w:val="ListParagraph"/>
+        <w:numPr>
+          <w:ilvl w:val="0"/>
+          <w:numId w:val="2"/>
+        </w:numPr>
+      </w:pPr>
+      <w:r>
+        <w:rPr>
+          <w:rFonts w:ascii="Calibri" w:cs="Calibri" w:eastAsia="Calibri" w:hAnsi="Calibri"/>
+          <w:sz w:val="20"/>
+          <w:szCs w:val="20"/>
+        </w:rPr>
+        <w:t xml:space="preserve">Deployed a 3-service async cloud-review API with night-hour and repeat-event risk escalation rules, verified against the live company MDVR server.</w:t>
       </w:r>
     </w:p>
     <w:p>
@@ -231,15 +248,15 @@
           <w:sz w:val="20"/>
           <w:szCs w:val="20"/>
         </w:rPr>
-        <w:t xml:space="preserve">AI Engineer Intern</w:t>
-      </w:r>
-      <w:r>
-        <w:rPr>
-          <w:rFonts w:ascii="Calibri" w:cs="Calibri" w:eastAsia="Calibri" w:hAnsi="Calibri"/>
-          <w:sz w:val="20"/>
-          <w:szCs w:val="20"/>
-        </w:rPr>
-        <w:t xml:space="preserve">	March 2025 – Present</w:t>
+        <w:t xml:space="preserve">Research Assistant, Bird Sound Identification</w:t>
+      </w:r>
+      <w:r>
+        <w:rPr>
+          <w:rFonts w:ascii="Calibri" w:cs="Calibri" w:eastAsia="Calibri" w:hAnsi="Calibri"/>
+          <w:sz w:val="20"/>
+          <w:szCs w:val="20"/>
+        </w:rPr>
+        <w:t xml:space="preserve">	November 2024 – December 2025</w:t>
       </w:r>
     </w:p>
     <w:p>
@@ -254,41 +271,41 @@
           <w:sz w:val="20"/>
           <w:szCs w:val="20"/>
         </w:rPr>
-        <w:t xml:space="preserve">Bandung Techno Park · Trans Track</w:t>
-      </w:r>
-    </w:p>
-    <w:p>
-      <w:pPr>
-        <w:pStyle w:val="ListParagraph"/>
-        <w:numPr>
-          <w:ilvl w:val="0"/>
-          <w:numId w:val="2"/>
-        </w:numPr>
-      </w:pPr>
-      <w:r>
-        <w:rPr>
-          <w:rFonts w:ascii="Calibri" w:cs="Calibri" w:eastAsia="Calibri" w:hAnsi="Calibri"/>
-          <w:sz w:val="20"/>
-          <w:szCs w:val="20"/>
-        </w:rPr>
-        <w:t xml:space="preserve">Designed a facial landmark sequence model from scratch on real dashcam footage from active mining fleet drivers at BIB, PAMA MTBU, and SIS. Achieved Macro F1 0.78, an 11% gain over the company’s production model.</w:t>
-      </w:r>
-    </w:p>
-    <w:p>
-      <w:pPr>
-        <w:pStyle w:val="ListParagraph"/>
-        <w:numPr>
-          <w:ilvl w:val="0"/>
-          <w:numId w:val="2"/>
-        </w:numPr>
-      </w:pPr>
-      <w:r>
-        <w:rPr>
-          <w:rFonts w:ascii="Calibri" w:cs="Calibri" w:eastAsia="Calibri" w:hAnsi="Calibri"/>
-          <w:sz w:val="20"/>
-          <w:szCs w:val="20"/>
-        </w:rPr>
-        <w:t xml:space="preserve">Deployed a 3-service async cloud-review API with night-hour and repeat-event risk escalation rules, verified against the live company MDVR server.</w:t>
+        <w:t xml:space="preserve">Telkom University</w:t>
+      </w:r>
+    </w:p>
+    <w:p>
+      <w:pPr>
+        <w:pStyle w:val="ListParagraph"/>
+        <w:numPr>
+          <w:ilvl w:val="0"/>
+          <w:numId w:val="2"/>
+        </w:numPr>
+      </w:pPr>
+      <w:r>
+        <w:rPr>
+          <w:rFonts w:ascii="Calibri" w:cs="Calibri" w:eastAsia="Calibri" w:hAnsi="Calibri"/>
+          <w:sz w:val="20"/>
+          <w:szCs w:val="20"/>
+        </w:rPr>
+        <w:t xml:space="preserve">Fine-tuned BirdNET v2.4 on 12,511 recordings across 219 endemic and endangered species in Indonesia, Malaysia, and Borneo. Macro F1 improved 44.1% over baseline on the endemic and endangered subset.</w:t>
+      </w:r>
+    </w:p>
+    <w:p>
+      <w:pPr>
+        <w:pStyle w:val="ListParagraph"/>
+        <w:numPr>
+          <w:ilvl w:val="0"/>
+          <w:numId w:val="2"/>
+        </w:numPr>
+      </w:pPr>
+      <w:r>
+        <w:rPr>
+          <w:rFonts w:ascii="Calibri" w:cs="Calibri" w:eastAsia="Calibri" w:hAnsi="Calibri"/>
+          <w:sz w:val="20"/>
+          <w:szCs w:val="20"/>
+        </w:rPr>
+        <w:t xml:space="preserve">First-authored a conference paper on the research, published at ICITACEE 2025 (IEEE Xplore).</w:t>
       </w:r>
     </w:p>
     <w:p>
@@ -306,15 +323,15 @@
           <w:sz w:val="20"/>
           <w:szCs w:val="20"/>
         </w:rPr>
-        <w:t xml:space="preserve">Research Assistant, Bird Sound Identification</w:t>
-      </w:r>
-      <w:r>
-        <w:rPr>
-          <w:rFonts w:ascii="Calibri" w:cs="Calibri" w:eastAsia="Calibri" w:hAnsi="Calibri"/>
-          <w:sz w:val="20"/>
-          <w:szCs w:val="20"/>
-        </w:rPr>
-        <w:t xml:space="preserve">	November 2024 – December 2025</w:t>
+        <w:t xml:space="preserve">Data Scientist Intern</w:t>
+      </w:r>
+      <w:r>
+        <w:rPr>
+          <w:rFonts w:ascii="Calibri" w:cs="Calibri" w:eastAsia="Calibri" w:hAnsi="Calibri"/>
+          <w:sz w:val="20"/>
+          <w:szCs w:val="20"/>
+        </w:rPr>
+        <w:t xml:space="preserve">	April 2025 – June 2025</w:t>
       </w:r>
     </w:p>
     <w:p>
@@ -329,41 +346,41 @@
           <w:sz w:val="20"/>
           <w:szCs w:val="20"/>
         </w:rPr>
-        <w:t xml:space="preserve">Telkom University</w:t>
-      </w:r>
-    </w:p>
-    <w:p>
-      <w:pPr>
-        <w:pStyle w:val="ListParagraph"/>
-        <w:numPr>
-          <w:ilvl w:val="0"/>
-          <w:numId w:val="2"/>
-        </w:numPr>
-      </w:pPr>
-      <w:r>
-        <w:rPr>
-          <w:rFonts w:ascii="Calibri" w:cs="Calibri" w:eastAsia="Calibri" w:hAnsi="Calibri"/>
-          <w:sz w:val="20"/>
-          <w:szCs w:val="20"/>
-        </w:rPr>
-        <w:t xml:space="preserve">Fine-tuned BirdNET v2.4 on 12,511 recordings across 219 endemic and endangered species in Indonesia, Malaysia, and Borneo. Macro F1 improved 44.1% over baseline on the endemic and endangered subset.</w:t>
-      </w:r>
-    </w:p>
-    <w:p>
-      <w:pPr>
-        <w:pStyle w:val="ListParagraph"/>
-        <w:numPr>
-          <w:ilvl w:val="0"/>
-          <w:numId w:val="2"/>
-        </w:numPr>
-      </w:pPr>
-      <w:r>
-        <w:rPr>
-          <w:rFonts w:ascii="Calibri" w:cs="Calibri" w:eastAsia="Calibri" w:hAnsi="Calibri"/>
-          <w:sz w:val="20"/>
-          <w:szCs w:val="20"/>
-        </w:rPr>
-        <w:t xml:space="preserve">First-authored a conference paper on the research, published at ICITACEE 2025 (IEEE Xplore).</w:t>
+        <w:t xml:space="preserve">HUMIC Engineering</w:t>
+      </w:r>
+    </w:p>
+    <w:p>
+      <w:pPr>
+        <w:pStyle w:val="ListParagraph"/>
+        <w:numPr>
+          <w:ilvl w:val="0"/>
+          <w:numId w:val="2"/>
+        </w:numPr>
+      </w:pPr>
+      <w:r>
+        <w:rPr>
+          <w:rFonts w:ascii="Calibri" w:cs="Calibri" w:eastAsia="Calibri" w:hAnsi="Calibri"/>
+          <w:sz w:val="20"/>
+          <w:szCs w:val="20"/>
+        </w:rPr>
+        <w:t xml:space="preserve">Screened 212+ papers using Zotero and Parsifal with AI-assisted triage, applying PRISMA-aligned quality assessment and structured data extraction.</w:t>
+      </w:r>
+    </w:p>
+    <w:p>
+      <w:pPr>
+        <w:pStyle w:val="ListParagraph"/>
+        <w:numPr>
+          <w:ilvl w:val="0"/>
+          <w:numId w:val="2"/>
+        </w:numPr>
+      </w:pPr>
+      <w:r>
+        <w:rPr>
+          <w:rFonts w:ascii="Calibri" w:cs="Calibri" w:eastAsia="Calibri" w:hAnsi="Calibri"/>
+          <w:sz w:val="20"/>
+          <w:szCs w:val="20"/>
+        </w:rPr>
+        <w:t xml:space="preserve">Produced a synthesis mapping publication trends by year, covering the full reviewed corpus.</w:t>
       </w:r>
     </w:p>
     <w:p>
@@ -381,15 +398,15 @@
           <w:sz w:val="20"/>
           <w:szCs w:val="20"/>
         </w:rPr>
-        <w:t xml:space="preserve">Data Scientist Intern</w:t>
-      </w:r>
-      <w:r>
-        <w:rPr>
-          <w:rFonts w:ascii="Calibri" w:cs="Calibri" w:eastAsia="Calibri" w:hAnsi="Calibri"/>
-          <w:sz w:val="20"/>
-          <w:szCs w:val="20"/>
-        </w:rPr>
-        <w:t xml:space="preserve">	April 2025 – June 2025</w:t>
+        <w:t xml:space="preserve">Research Assistant, Whole-Body Bone Scintigraphy</w:t>
+      </w:r>
+      <w:r>
+        <w:rPr>
+          <w:rFonts w:ascii="Calibri" w:cs="Calibri" w:eastAsia="Calibri" w:hAnsi="Calibri"/>
+          <w:sz w:val="20"/>
+          <w:szCs w:val="20"/>
+        </w:rPr>
+        <w:t xml:space="preserve">	August 2024 – February 2025</w:t>
       </w:r>
     </w:p>
     <w:p>
@@ -404,41 +421,41 @@
           <w:sz w:val="20"/>
           <w:szCs w:val="20"/>
         </w:rPr>
-        <w:t xml:space="preserve">HUMIC Engineering</w:t>
-      </w:r>
-    </w:p>
-    <w:p>
-      <w:pPr>
-        <w:pStyle w:val="ListParagraph"/>
-        <w:numPr>
-          <w:ilvl w:val="0"/>
-          <w:numId w:val="2"/>
-        </w:numPr>
-      </w:pPr>
-      <w:r>
-        <w:rPr>
-          <w:rFonts w:ascii="Calibri" w:cs="Calibri" w:eastAsia="Calibri" w:hAnsi="Calibri"/>
-          <w:sz w:val="20"/>
-          <w:szCs w:val="20"/>
-        </w:rPr>
-        <w:t xml:space="preserve">Screened 212+ papers using Zotero and Parsifal with AI-assisted triage, applying PRISMA-aligned quality assessment and structured data extraction.</w:t>
-      </w:r>
-    </w:p>
-    <w:p>
-      <w:pPr>
-        <w:pStyle w:val="ListParagraph"/>
-        <w:numPr>
-          <w:ilvl w:val="0"/>
-          <w:numId w:val="2"/>
-        </w:numPr>
-      </w:pPr>
-      <w:r>
-        <w:rPr>
-          <w:rFonts w:ascii="Calibri" w:cs="Calibri" w:eastAsia="Calibri" w:hAnsi="Calibri"/>
-          <w:sz w:val="20"/>
-          <w:szCs w:val="20"/>
-        </w:rPr>
-        <w:t xml:space="preserve">Produced a synthesis mapping publication trends by year, covering the full reviewed corpus.</w:t>
+        <w:t xml:space="preserve">Telkom University</w:t>
+      </w:r>
+    </w:p>
+    <w:p>
+      <w:pPr>
+        <w:pStyle w:val="ListParagraph"/>
+        <w:numPr>
+          <w:ilvl w:val="0"/>
+          <w:numId w:val="2"/>
+        </w:numPr>
+      </w:pPr>
+      <w:r>
+        <w:rPr>
+          <w:rFonts w:ascii="Calibri" w:cs="Calibri" w:eastAsia="Calibri" w:hAnsi="Calibri"/>
+          <w:sz w:val="20"/>
+          <w:szCs w:val="20"/>
+        </w:rPr>
+        <w:t xml:space="preserve">Annotated 600+ whole-body bone scan images supervised by nuclear medicine physicians at Dr. Hasan Sadikin Hospital, Universitas Padjadjaran.</w:t>
+      </w:r>
+    </w:p>
+    <w:p>
+      <w:pPr>
+        <w:pStyle w:val="ListParagraph"/>
+        <w:numPr>
+          <w:ilvl w:val="0"/>
+          <w:numId w:val="2"/>
+        </w:numPr>
+      </w:pPr>
+      <w:r>
+        <w:rPr>
+          <w:rFonts w:ascii="Calibri" w:cs="Calibri" w:eastAsia="Calibri" w:hAnsi="Calibri"/>
+          <w:sz w:val="20"/>
+          <w:szCs w:val="20"/>
+        </w:rPr>
+        <w:t xml:space="preserve">Built hotspot detection with YOLOv8 (mAP@0.5 = 0.599) and skeletal segmentation with nnU-Net v2 across 12 anatomical regions (IoU 0.879). Patient-level AUC 0.956, surpassing EXINI (0.83–0.88) and BONENAVI (0.84–0.89).</w:t>
       </w:r>
     </w:p>
     <w:p>
@@ -456,15 +473,15 @@
           <w:sz w:val="20"/>
           <w:szCs w:val="20"/>
         </w:rPr>
-        <w:t xml:space="preserve">Research Assistant, Whole-Body Bone Scintigraphy</w:t>
-      </w:r>
-      <w:r>
-        <w:rPr>
-          <w:rFonts w:ascii="Calibri" w:cs="Calibri" w:eastAsia="Calibri" w:hAnsi="Calibri"/>
-          <w:sz w:val="20"/>
-          <w:szCs w:val="20"/>
-        </w:rPr>
-        <w:t xml:space="preserve">	August 2024 – February 2025</w:t>
+        <w:t xml:space="preserve">Study Group Coordinator</w:t>
+      </w:r>
+      <w:r>
+        <w:rPr>
+          <w:rFonts w:ascii="Calibri" w:cs="Calibri" w:eastAsia="Calibri" w:hAnsi="Calibri"/>
+          <w:sz w:val="20"/>
+          <w:szCs w:val="20"/>
+        </w:rPr>
+        <w:t xml:space="preserve">	June 2025 – February 2026</w:t>
       </w:r>
     </w:p>
     <w:p>
@@ -479,41 +496,41 @@
           <w:sz w:val="20"/>
           <w:szCs w:val="20"/>
         </w:rPr>
-        <w:t xml:space="preserve">Telkom University</w:t>
-      </w:r>
-    </w:p>
-    <w:p>
-      <w:pPr>
-        <w:pStyle w:val="ListParagraph"/>
-        <w:numPr>
-          <w:ilvl w:val="0"/>
-          <w:numId w:val="2"/>
-        </w:numPr>
-      </w:pPr>
-      <w:r>
-        <w:rPr>
-          <w:rFonts w:ascii="Calibri" w:cs="Calibri" w:eastAsia="Calibri" w:hAnsi="Calibri"/>
-          <w:sz w:val="20"/>
-          <w:szCs w:val="20"/>
-        </w:rPr>
-        <w:t xml:space="preserve">Annotated 600+ whole-body bone scan images supervised by nuclear medicine physicians at Dr. Hasan Sadikin Hospital, Universitas Padjadjaran.</w:t>
-      </w:r>
-    </w:p>
-    <w:p>
-      <w:pPr>
-        <w:pStyle w:val="ListParagraph"/>
-        <w:numPr>
-          <w:ilvl w:val="0"/>
-          <w:numId w:val="2"/>
-        </w:numPr>
-      </w:pPr>
-      <w:r>
-        <w:rPr>
-          <w:rFonts w:ascii="Calibri" w:cs="Calibri" w:eastAsia="Calibri" w:hAnsi="Calibri"/>
-          <w:sz w:val="20"/>
-          <w:szCs w:val="20"/>
-        </w:rPr>
-        <w:t xml:space="preserve">Built hotspot detection with YOLOv8 (mAP@0.5 = 0.599) and skeletal segmentation with nnU-Net v2 across 12 anatomical regions (IoU 0.879). Patient-level AUC 0.956, surpassing EXINI (0.83–0.88) and BONENAVI (0.84–0.89).</w:t>
+        <w:t xml:space="preserve">AI Lab, Telkom University</w:t>
+      </w:r>
+    </w:p>
+    <w:p>
+      <w:pPr>
+        <w:pStyle w:val="ListParagraph"/>
+        <w:numPr>
+          <w:ilvl w:val="0"/>
+          <w:numId w:val="2"/>
+        </w:numPr>
+      </w:pPr>
+      <w:r>
+        <w:rPr>
+          <w:rFonts w:ascii="Calibri" w:cs="Calibri" w:eastAsia="Calibri" w:hAnsi="Calibri"/>
+          <w:sz w:val="20"/>
+          <w:szCs w:val="20"/>
+        </w:rPr>
+        <w:t xml:space="preserve">Recruited, taught, and evaluated 29 students across weekly sessions and a final project.</w:t>
+      </w:r>
+    </w:p>
+    <w:p>
+      <w:pPr>
+        <w:pStyle w:val="ListParagraph"/>
+        <w:numPr>
+          <w:ilvl w:val="0"/>
+          <w:numId w:val="2"/>
+        </w:numPr>
+      </w:pPr>
+      <w:r>
+        <w:rPr>
+          <w:rFonts w:ascii="Calibri" w:cs="Calibri" w:eastAsia="Calibri" w:hAnsi="Calibri"/>
+          <w:sz w:val="20"/>
+          <w:szCs w:val="20"/>
+        </w:rPr>
+        <w:t xml:space="preserve">Supervised 15 project groups from proposal to final demonstration, assessing technical execution and research quality at each stage.</w:t>
       </w:r>
     </w:p>
     <w:p>
@@ -531,15 +548,15 @@
           <w:sz w:val="20"/>
           <w:szCs w:val="20"/>
         </w:rPr>
-        <w:t xml:space="preserve">Study Group Coordinator</w:t>
-      </w:r>
-      <w:r>
-        <w:rPr>
-          <w:rFonts w:ascii="Calibri" w:cs="Calibri" w:eastAsia="Calibri" w:hAnsi="Calibri"/>
-          <w:sz w:val="20"/>
-          <w:szCs w:val="20"/>
-        </w:rPr>
-        <w:t xml:space="preserve">	June 2025 – February 2026</w:t>
+        <w:t xml:space="preserve">Staff, Research and Development</w:t>
+      </w:r>
+      <w:r>
+        <w:rPr>
+          <w:rFonts w:ascii="Calibri" w:cs="Calibri" w:eastAsia="Calibri" w:hAnsi="Calibri"/>
+          <w:sz w:val="20"/>
+          <w:szCs w:val="20"/>
+        </w:rPr>
+        <w:t xml:space="preserve">	January 2025 – January 2026</w:t>
       </w:r>
     </w:p>
     <w:p>
@@ -554,41 +571,41 @@
           <w:sz w:val="20"/>
           <w:szCs w:val="20"/>
         </w:rPr>
-        <w:t xml:space="preserve">AI Lab, Telkom University</w:t>
-      </w:r>
-    </w:p>
-    <w:p>
-      <w:pPr>
-        <w:pStyle w:val="ListParagraph"/>
-        <w:numPr>
-          <w:ilvl w:val="0"/>
-          <w:numId w:val="2"/>
-        </w:numPr>
-      </w:pPr>
-      <w:r>
-        <w:rPr>
-          <w:rFonts w:ascii="Calibri" w:cs="Calibri" w:eastAsia="Calibri" w:hAnsi="Calibri"/>
-          <w:sz w:val="20"/>
-          <w:szCs w:val="20"/>
-        </w:rPr>
-        <w:t xml:space="preserve">Recruited, taught, and evaluated 29 students across weekly sessions and a final project.</w:t>
-      </w:r>
-    </w:p>
-    <w:p>
-      <w:pPr>
-        <w:pStyle w:val="ListParagraph"/>
-        <w:numPr>
-          <w:ilvl w:val="0"/>
-          <w:numId w:val="2"/>
-        </w:numPr>
-      </w:pPr>
-      <w:r>
-        <w:rPr>
-          <w:rFonts w:ascii="Calibri" w:cs="Calibri" w:eastAsia="Calibri" w:hAnsi="Calibri"/>
-          <w:sz w:val="20"/>
-          <w:szCs w:val="20"/>
-        </w:rPr>
-        <w:t xml:space="preserve">Supervised 15 project groups from proposal to final demonstration, assessing technical execution and research quality at each stage.</w:t>
+        <w:t xml:space="preserve">IEEE Student Branch, Telkom University</w:t>
+      </w:r>
+    </w:p>
+    <w:p>
+      <w:pPr>
+        <w:pStyle w:val="ListParagraph"/>
+        <w:numPr>
+          <w:ilvl w:val="0"/>
+          <w:numId w:val="2"/>
+        </w:numPr>
+      </w:pPr>
+      <w:r>
+        <w:rPr>
+          <w:rFonts w:ascii="Calibri" w:cs="Calibri" w:eastAsia="Calibri" w:hAnsi="Calibri"/>
+          <w:sz w:val="20"/>
+          <w:szCs w:val="20"/>
+        </w:rPr>
+        <w:t xml:space="preserve">Led branch team at YESIST12 Maker Fair. Placed Top 25 at Data Slayer 2.0 Data Science Competition.</w:t>
+      </w:r>
+    </w:p>
+    <w:p>
+      <w:pPr>
+        <w:pStyle w:val="ListParagraph"/>
+        <w:numPr>
+          <w:ilvl w:val="0"/>
+          <w:numId w:val="2"/>
+        </w:numPr>
+      </w:pPr>
+      <w:r>
+        <w:rPr>
+          <w:rFonts w:ascii="Calibri" w:cs="Calibri" w:eastAsia="Calibri" w:hAnsi="Calibri"/>
+          <w:sz w:val="20"/>
+          <w:szCs w:val="20"/>
+        </w:rPr>
+        <w:t xml:space="preserve">Tracked and distributed competition opportunities across IEEE and BELMAWA programs to branch members.</w:t>
       </w:r>
     </w:p>
     <w:p>
@@ -606,15 +623,15 @@
           <w:sz w:val="20"/>
           <w:szCs w:val="20"/>
         </w:rPr>
-        <w:t xml:space="preserve">Staff, Research and Development</w:t>
-      </w:r>
-      <w:r>
-        <w:rPr>
-          <w:rFonts w:ascii="Calibri" w:cs="Calibri" w:eastAsia="Calibri" w:hAnsi="Calibri"/>
-          <w:sz w:val="20"/>
-          <w:szCs w:val="20"/>
-        </w:rPr>
-        <w:t xml:space="preserve">	January 2025 – January 2026</w:t>
+        <w:t xml:space="preserve">Study Group Member</w:t>
+      </w:r>
+      <w:r>
+        <w:rPr>
+          <w:rFonts w:ascii="Calibri" w:cs="Calibri" w:eastAsia="Calibri" w:hAnsi="Calibri"/>
+          <w:sz w:val="20"/>
+          <w:szCs w:val="20"/>
+        </w:rPr>
+        <w:t xml:space="preserve">	October 2024 – February 2025</w:t>
       </w:r>
     </w:p>
     <w:p>
@@ -629,41 +646,41 @@
           <w:sz w:val="20"/>
           <w:szCs w:val="20"/>
         </w:rPr>
-        <w:t xml:space="preserve">IEEE Student Branch, Telkom University</w:t>
-      </w:r>
-    </w:p>
-    <w:p>
-      <w:pPr>
-        <w:pStyle w:val="ListParagraph"/>
-        <w:numPr>
-          <w:ilvl w:val="0"/>
-          <w:numId w:val="2"/>
-        </w:numPr>
-      </w:pPr>
-      <w:r>
-        <w:rPr>
-          <w:rFonts w:ascii="Calibri" w:cs="Calibri" w:eastAsia="Calibri" w:hAnsi="Calibri"/>
-          <w:sz w:val="20"/>
-          <w:szCs w:val="20"/>
-        </w:rPr>
-        <w:t xml:space="preserve">Led branch team at YESIST12 Maker Fair. Placed Top 25 at Data Slayer 2.0 Data Science Competition.</w:t>
-      </w:r>
-    </w:p>
-    <w:p>
-      <w:pPr>
-        <w:pStyle w:val="ListParagraph"/>
-        <w:numPr>
-          <w:ilvl w:val="0"/>
-          <w:numId w:val="2"/>
-        </w:numPr>
-      </w:pPr>
-      <w:r>
-        <w:rPr>
-          <w:rFonts w:ascii="Calibri" w:cs="Calibri" w:eastAsia="Calibri" w:hAnsi="Calibri"/>
-          <w:sz w:val="20"/>
-          <w:szCs w:val="20"/>
-        </w:rPr>
-        <w:t xml:space="preserve">Tracked and distributed competition opportunities across IEEE and BELMAWA programs to branch members.</w:t>
+        <w:t xml:space="preserve">AI Lab, Telkom University</w:t>
+      </w:r>
+    </w:p>
+    <w:p>
+      <w:pPr>
+        <w:pStyle w:val="ListParagraph"/>
+        <w:numPr>
+          <w:ilvl w:val="0"/>
+          <w:numId w:val="2"/>
+        </w:numPr>
+      </w:pPr>
+      <w:r>
+        <w:rPr>
+          <w:rFonts w:ascii="Calibri" w:cs="Calibri" w:eastAsia="Calibri" w:hAnsi="Calibri"/>
+          <w:sz w:val="20"/>
+          <w:szCs w:val="20"/>
+        </w:rPr>
+        <w:t xml:space="preserve">Led the plant disease classifier project: data cleaning, computer vision model training, and Streamlit deployment. Delivered in one semester.</w:t>
+      </w:r>
+    </w:p>
+    <w:p>
+      <w:pPr>
+        <w:pStyle w:val="ListParagraph"/>
+        <w:numPr>
+          <w:ilvl w:val="0"/>
+          <w:numId w:val="2"/>
+        </w:numPr>
+      </w:pPr>
+      <w:r>
+        <w:rPr>
+          <w:rFonts w:ascii="Calibri" w:cs="Calibri" w:eastAsia="Calibri" w:hAnsi="Calibri"/>
+          <w:sz w:val="20"/>
+          <w:szCs w:val="20"/>
+        </w:rPr>
+        <w:t xml:space="preserve">Won 3rd place at CCI Summit Kaggle, first time as team lead. Awarded 2nd Best Final Project in the Study Group.</w:t>
       </w:r>
     </w:p>
     <w:p>
@@ -681,15 +698,15 @@
           <w:sz w:val="20"/>
           <w:szCs w:val="20"/>
         </w:rPr>
-        <w:t xml:space="preserve">Study Group Member</w:t>
-      </w:r>
-      <w:r>
-        <w:rPr>
-          <w:rFonts w:ascii="Calibri" w:cs="Calibri" w:eastAsia="Calibri" w:hAnsi="Calibri"/>
-          <w:sz w:val="20"/>
-          <w:szCs w:val="20"/>
-        </w:rPr>
-        <w:t xml:space="preserve">	October 2024 – February 2025</w:t>
+        <w:t xml:space="preserve">Assistant Lecturer, Programming and Algorithms II</w:t>
+      </w:r>
+      <w:r>
+        <w:rPr>
+          <w:rFonts w:ascii="Calibri" w:cs="Calibri" w:eastAsia="Calibri" w:hAnsi="Calibri"/>
+          <w:sz w:val="20"/>
+          <w:szCs w:val="20"/>
+        </w:rPr>
+        <w:t xml:space="preserve">	February 2025 – June 2025</w:t>
       </w:r>
     </w:p>
     <w:p>
@@ -704,41 +721,41 @@
           <w:sz w:val="20"/>
           <w:szCs w:val="20"/>
         </w:rPr>
-        <w:t xml:space="preserve">AI Lab, Telkom University</w:t>
-      </w:r>
-    </w:p>
-    <w:p>
-      <w:pPr>
-        <w:pStyle w:val="ListParagraph"/>
-        <w:numPr>
-          <w:ilvl w:val="0"/>
-          <w:numId w:val="2"/>
-        </w:numPr>
-      </w:pPr>
-      <w:r>
-        <w:rPr>
-          <w:rFonts w:ascii="Calibri" w:cs="Calibri" w:eastAsia="Calibri" w:hAnsi="Calibri"/>
-          <w:sz w:val="20"/>
-          <w:szCs w:val="20"/>
-        </w:rPr>
-        <w:t xml:space="preserve">Led the plant disease classifier project: data cleaning, computer vision model training, and Streamlit deployment. Delivered in one semester.</w:t>
-      </w:r>
-    </w:p>
-    <w:p>
-      <w:pPr>
-        <w:pStyle w:val="ListParagraph"/>
-        <w:numPr>
-          <w:ilvl w:val="0"/>
-          <w:numId w:val="2"/>
-        </w:numPr>
-      </w:pPr>
-      <w:r>
-        <w:rPr>
-          <w:rFonts w:ascii="Calibri" w:cs="Calibri" w:eastAsia="Calibri" w:hAnsi="Calibri"/>
-          <w:sz w:val="20"/>
-          <w:szCs w:val="20"/>
-        </w:rPr>
-        <w:t xml:space="preserve">Won 3rd place at CCI Summit Kaggle, first time as team lead. Awarded 2nd Best Final Project in the Study Group.</w:t>
+        <w:t xml:space="preserve">School of Informatics, Telkom University</w:t>
+      </w:r>
+    </w:p>
+    <w:p>
+      <w:pPr>
+        <w:pStyle w:val="ListParagraph"/>
+        <w:numPr>
+          <w:ilvl w:val="0"/>
+          <w:numId w:val="2"/>
+        </w:numPr>
+      </w:pPr>
+      <w:r>
+        <w:rPr>
+          <w:rFonts w:ascii="Calibri" w:cs="Calibri" w:eastAsia="Calibri" w:hAnsi="Calibri"/>
+          <w:sz w:val="20"/>
+          <w:szCs w:val="20"/>
+        </w:rPr>
+        <w:t xml:space="preserve">Reviewed and corrected 200+ quiz questions with course lecturers before release to students.</w:t>
+      </w:r>
+    </w:p>
+    <w:p>
+      <w:pPr>
+        <w:pStyle w:val="ListParagraph"/>
+        <w:numPr>
+          <w:ilvl w:val="0"/>
+          <w:numId w:val="2"/>
+        </w:numPr>
+      </w:pPr>
+      <w:r>
+        <w:rPr>
+          <w:rFonts w:ascii="Calibri" w:cs="Calibri" w:eastAsia="Calibri" w:hAnsi="Calibri"/>
+          <w:sz w:val="20"/>
+          <w:szCs w:val="20"/>
+        </w:rPr>
+        <w:t xml:space="preserve">Supported 40+ students with real-time debugging during live programming assessments.</w:t>
       </w:r>
     </w:p>
     <w:p>
@@ -756,15 +773,15 @@
           <w:sz w:val="20"/>
           <w:szCs w:val="20"/>
         </w:rPr>
-        <w:t xml:space="preserve">Assistant Lecturer, Programming and Algorithms II</w:t>
-      </w:r>
-      <w:r>
-        <w:rPr>
-          <w:rFonts w:ascii="Calibri" w:cs="Calibri" w:eastAsia="Calibri" w:hAnsi="Calibri"/>
-          <w:sz w:val="20"/>
-          <w:szCs w:val="20"/>
-        </w:rPr>
-        <w:t xml:space="preserve">	February 2025 – June 2025</w:t>
+        <w:t xml:space="preserve">Assistant Lecturer, Calculus I</w:t>
+      </w:r>
+      <w:r>
+        <w:rPr>
+          <w:rFonts w:ascii="Calibri" w:cs="Calibri" w:eastAsia="Calibri" w:hAnsi="Calibri"/>
+          <w:sz w:val="20"/>
+          <w:szCs w:val="20"/>
+        </w:rPr>
+        <w:t xml:space="preserve">	September 2024 – January 2025</w:t>
       </w:r>
     </w:p>
     <w:p>
@@ -796,24 +813,7 @@
           <w:sz w:val="20"/>
           <w:szCs w:val="20"/>
         </w:rPr>
-        <w:t xml:space="preserve">Reviewed and corrected 200+ quiz questions with course lecturers before release to students.</w:t>
-      </w:r>
-    </w:p>
-    <w:p>
-      <w:pPr>
-        <w:pStyle w:val="ListParagraph"/>
-        <w:numPr>
-          <w:ilvl w:val="0"/>
-          <w:numId w:val="2"/>
-        </w:numPr>
-      </w:pPr>
-      <w:r>
-        <w:rPr>
-          <w:rFonts w:ascii="Calibri" w:cs="Calibri" w:eastAsia="Calibri" w:hAnsi="Calibri"/>
-          <w:sz w:val="20"/>
-          <w:szCs w:val="20"/>
-        </w:rPr>
-        <w:t xml:space="preserve">Supported 40+ students with real-time debugging during live programming assessments.</w:t>
+        <w:t xml:space="preserve">Tutored 40+ students across weekly sessions. Graded four major assessments.</w:t>
       </w:r>
     </w:p>
     <w:p>
@@ -831,15 +831,15 @@
           <w:sz w:val="20"/>
           <w:szCs w:val="20"/>
         </w:rPr>
-        <w:t xml:space="preserve">Assistant Lecturer, Calculus I</w:t>
-      </w:r>
-      <w:r>
-        <w:rPr>
-          <w:rFonts w:ascii="Calibri" w:cs="Calibri" w:eastAsia="Calibri" w:hAnsi="Calibri"/>
-          <w:sz w:val="20"/>
-          <w:szCs w:val="20"/>
-        </w:rPr>
-        <w:t xml:space="preserve">	September 2024 – January 2025</w:t>
+        <w:t xml:space="preserve">Member, Data Research Division</w:t>
+      </w:r>
+      <w:r>
+        <w:rPr>
+          <w:rFonts w:ascii="Calibri" w:cs="Calibri" w:eastAsia="Calibri" w:hAnsi="Calibri"/>
+          <w:sz w:val="20"/>
+          <w:szCs w:val="20"/>
+        </w:rPr>
+        <w:t xml:space="preserve">	August 2023 – May 2024</w:t>
       </w:r>
     </w:p>
     <w:p>
@@ -854,24 +854,24 @@
           <w:sz w:val="20"/>
           <w:szCs w:val="20"/>
         </w:rPr>
-        <w:t xml:space="preserve">School of Informatics, Telkom University</w:t>
-      </w:r>
-    </w:p>
-    <w:p>
-      <w:pPr>
-        <w:pStyle w:val="ListParagraph"/>
-        <w:numPr>
-          <w:ilvl w:val="0"/>
-          <w:numId w:val="2"/>
-        </w:numPr>
-      </w:pPr>
-      <w:r>
-        <w:rPr>
-          <w:rFonts w:ascii="Calibri" w:cs="Calibri" w:eastAsia="Calibri" w:hAnsi="Calibri"/>
-          <w:sz w:val="20"/>
-          <w:szCs w:val="20"/>
-        </w:rPr>
-        <w:t xml:space="preserve">Tutored 40+ students across weekly sessions. Graded four major assessments.</w:t>
+        <w:t xml:space="preserve">Central Computer Improvement (CCI), Telkom University</w:t>
+      </w:r>
+    </w:p>
+    <w:p>
+      <w:pPr>
+        <w:pStyle w:val="ListParagraph"/>
+        <w:numPr>
+          <w:ilvl w:val="0"/>
+          <w:numId w:val="2"/>
+        </w:numPr>
+      </w:pPr>
+      <w:r>
+        <w:rPr>
+          <w:rFonts w:ascii="Calibri" w:cs="Calibri" w:eastAsia="Calibri" w:hAnsi="Calibri"/>
+          <w:sz w:val="20"/>
+          <w:szCs w:val="20"/>
+        </w:rPr>
+        <w:t xml:space="preserve">Built a multi-class sentiment detection model achieving 70% accuracy using LSTM, GRU, BERT, LightGBM, XGBoost, and CatBoost.</w:t>
       </w:r>
     </w:p>
     <w:p>
@@ -889,15 +889,15 @@
           <w:sz w:val="20"/>
           <w:szCs w:val="20"/>
         </w:rPr>
-        <w:t xml:space="preserve">Member, Data Research Division</w:t>
-      </w:r>
-      <w:r>
-        <w:rPr>
-          <w:rFonts w:ascii="Calibri" w:cs="Calibri" w:eastAsia="Calibri" w:hAnsi="Calibri"/>
-          <w:sz w:val="20"/>
-          <w:szCs w:val="20"/>
-        </w:rPr>
-        <w:t xml:space="preserve">	August 2023 – May 2024</w:t>
+        <w:t xml:space="preserve">Education Volunteer</w:t>
+      </w:r>
+      <w:r>
+        <w:rPr>
+          <w:rFonts w:ascii="Calibri" w:cs="Calibri" w:eastAsia="Calibri" w:hAnsi="Calibri"/>
+          <w:sz w:val="20"/>
+          <w:szCs w:val="20"/>
+        </w:rPr>
+        <w:t xml:space="preserve">	September 2024 – November 2024</w:t>
       </w:r>
     </w:p>
     <w:p>
@@ -912,24 +912,24 @@
           <w:sz w:val="20"/>
           <w:szCs w:val="20"/>
         </w:rPr>
-        <w:t xml:space="preserve">Central Computer Improvement (CCI), Telkom University</w:t>
-      </w:r>
-    </w:p>
-    <w:p>
-      <w:pPr>
-        <w:pStyle w:val="ListParagraph"/>
-        <w:numPr>
-          <w:ilvl w:val="0"/>
-          <w:numId w:val="2"/>
-        </w:numPr>
-      </w:pPr>
-      <w:r>
-        <w:rPr>
-          <w:rFonts w:ascii="Calibri" w:cs="Calibri" w:eastAsia="Calibri" w:hAnsi="Calibri"/>
-          <w:sz w:val="20"/>
-          <w:szCs w:val="20"/>
-        </w:rPr>
-        <w:t xml:space="preserve">Built a multi-class sentiment detection model achieving 70% accuracy using LSTM, GRU, BERT, LightGBM, XGBoost, and CatBoost.</w:t>
+        <w:t xml:space="preserve">Bebras – Telkom University</w:t>
+      </w:r>
+    </w:p>
+    <w:p>
+      <w:pPr>
+        <w:pStyle w:val="ListParagraph"/>
+        <w:numPr>
+          <w:ilvl w:val="0"/>
+          <w:numId w:val="2"/>
+        </w:numPr>
+      </w:pPr>
+      <w:r>
+        <w:rPr>
+          <w:rFonts w:ascii="Calibri" w:cs="Calibri" w:eastAsia="Calibri" w:hAnsi="Calibri"/>
+          <w:sz w:val="20"/>
+          <w:szCs w:val="20"/>
+        </w:rPr>
+        <w:t xml:space="preserve">Designed and delivered computational thinking activities for junior high students at SMP Negeri 1 Pacet.</w:t>
       </w:r>
     </w:p>
     <w:p>
@@ -947,15 +947,15 @@
           <w:sz w:val="20"/>
           <w:szCs w:val="20"/>
         </w:rPr>
-        <w:t xml:space="preserve">Education Volunteer</w:t>
-      </w:r>
-      <w:r>
-        <w:rPr>
-          <w:rFonts w:ascii="Calibri" w:cs="Calibri" w:eastAsia="Calibri" w:hAnsi="Calibri"/>
-          <w:sz w:val="20"/>
-          <w:szCs w:val="20"/>
-        </w:rPr>
-        <w:t xml:space="preserve">	September 2024 – November 2024</w:t>
+        <w:t xml:space="preserve">Registration Committee</w:t>
+      </w:r>
+      <w:r>
+        <w:rPr>
+          <w:rFonts w:ascii="Calibri" w:cs="Calibri" w:eastAsia="Calibri" w:hAnsi="Calibri"/>
+          <w:sz w:val="20"/>
+          <w:szCs w:val="20"/>
+        </w:rPr>
+        <w:t xml:space="preserve">	November 2025 – January 2026</w:t>
       </w:r>
     </w:p>
     <w:p>
@@ -970,24 +970,24 @@
           <w:sz w:val="20"/>
           <w:szCs w:val="20"/>
         </w:rPr>
-        <w:t xml:space="preserve">Bebras – Telkom University</w:t>
-      </w:r>
-    </w:p>
-    <w:p>
-      <w:pPr>
-        <w:pStyle w:val="ListParagraph"/>
-        <w:numPr>
-          <w:ilvl w:val="0"/>
-          <w:numId w:val="2"/>
-        </w:numPr>
-      </w:pPr>
-      <w:r>
-        <w:rPr>
-          <w:rFonts w:ascii="Calibri" w:cs="Calibri" w:eastAsia="Calibri" w:hAnsi="Calibri"/>
-          <w:sz w:val="20"/>
-          <w:szCs w:val="20"/>
-        </w:rPr>
-        <w:t xml:space="preserve">Designed and delivered computational thinking activities for junior high students at SMP Negeri 1 Pacet.</w:t>
+        <w:t xml:space="preserve">Bebras – Telkom University Bureau</w:t>
+      </w:r>
+    </w:p>
+    <w:p>
+      <w:pPr>
+        <w:pStyle w:val="ListParagraph"/>
+        <w:numPr>
+          <w:ilvl w:val="0"/>
+          <w:numId w:val="2"/>
+        </w:numPr>
+      </w:pPr>
+      <w:r>
+        <w:rPr>
+          <w:rFonts w:ascii="Calibri" w:cs="Calibri" w:eastAsia="Calibri" w:hAnsi="Calibri"/>
+          <w:sz w:val="20"/>
+          <w:szCs w:val="20"/>
+        </w:rPr>
+        <w:t xml:space="preserve">Cleaned and prepared registration data for 1,000+ participants nationwide using Python scripts and Google Sheets.</w:t>
       </w:r>
     </w:p>
     <w:p>
@@ -1005,15 +1005,15 @@
           <w:sz w:val="20"/>
           <w:szCs w:val="20"/>
         </w:rPr>
-        <w:t xml:space="preserve">Registration Committee</w:t>
-      </w:r>
-      <w:r>
-        <w:rPr>
-          <w:rFonts w:ascii="Calibri" w:cs="Calibri" w:eastAsia="Calibri" w:hAnsi="Calibri"/>
-          <w:sz w:val="20"/>
-          <w:szCs w:val="20"/>
-        </w:rPr>
-        <w:t xml:space="preserve">	November 2025 – January 2026</w:t>
+        <w:t xml:space="preserve">Paper Reviewer and Room Coordinator</w:t>
+      </w:r>
+      <w:r>
+        <w:rPr>
+          <w:rFonts w:ascii="Calibri" w:cs="Calibri" w:eastAsia="Calibri" w:hAnsi="Calibri"/>
+          <w:sz w:val="20"/>
+          <w:szCs w:val="20"/>
+        </w:rPr>
+        <w:t xml:space="preserve">	August 2024 – September 2024</w:t>
       </w:r>
     </w:p>
     <w:p>
@@ -1028,24 +1028,391 @@
           <w:sz w:val="20"/>
           <w:szCs w:val="20"/>
         </w:rPr>
-        <w:t xml:space="preserve">Bebras – Telkom University Bureau</w:t>
-      </w:r>
-    </w:p>
-    <w:p>
-      <w:pPr>
-        <w:pStyle w:val="ListParagraph"/>
-        <w:numPr>
-          <w:ilvl w:val="0"/>
-          <w:numId w:val="2"/>
-        </w:numPr>
-      </w:pPr>
-      <w:r>
-        <w:rPr>
-          <w:rFonts w:ascii="Calibri" w:cs="Calibri" w:eastAsia="Calibri" w:hAnsi="Calibri"/>
-          <w:sz w:val="20"/>
-          <w:szCs w:val="20"/>
-        </w:rPr>
-        <w:t xml:space="preserve">Cleaned and prepared registration data for 1,000+ participants nationwide using Python and Google Sheets.</w:t>
+        <w:t xml:space="preserve">ICoICT 2024</w:t>
+      </w:r>
+    </w:p>
+    <w:p>
+      <w:pPr>
+        <w:pStyle w:val="ListParagraph"/>
+        <w:numPr>
+          <w:ilvl w:val="0"/>
+          <w:numId w:val="2"/>
+        </w:numPr>
+      </w:pPr>
+      <w:r>
+        <w:rPr>
+          <w:rFonts w:ascii="Calibri" w:cs="Calibri" w:eastAsia="Calibri" w:hAnsi="Calibri"/>
+          <w:sz w:val="20"/>
+          <w:szCs w:val="20"/>
+        </w:rPr>
+        <w:t xml:space="preserve">Reviewed 4 conference papers and returned corrections ahead of deadline.</w:t>
+      </w:r>
+    </w:p>
+    <w:p>
+      <w:pPr>
+        <w:pStyle w:val="ListParagraph"/>
+        <w:numPr>
+          <w:ilvl w:val="0"/>
+          <w:numId w:val="2"/>
+        </w:numPr>
+      </w:pPr>
+      <w:r>
+        <w:rPr>
+          <w:rFonts w:ascii="Calibri" w:cs="Calibri" w:eastAsia="Calibri" w:hAnsi="Calibri"/>
+          <w:sz w:val="20"/>
+          <w:szCs w:val="20"/>
+        </w:rPr>
+        <w:t xml:space="preserve">Managed AV setup for 4 sessions, assisted 22 presenters.</w:t>
+      </w:r>
+    </w:p>
+    <w:p>
+      <w:pPr>
+        <w:pBdr>
+          <w:bottom w:val="single" w:color="000000" w:sz="4" w:space="2"/>
+        </w:pBdr>
+        <w:spacing w:after="80" w:before="200"/>
+      </w:pPr>
+      <w:r>
+        <w:rPr>
+          <w:rFonts w:ascii="Calibri" w:cs="Calibri" w:eastAsia="Calibri" w:hAnsi="Calibri"/>
+          <w:b/>
+          <w:bCs/>
+          <w:caps/>
+          <w:sz w:val="22"/>
+          <w:szCs w:val="22"/>
+        </w:rPr>
+        <w:t xml:space="preserve">Publications</w:t>
+      </w:r>
+    </w:p>
+    <w:p>
+      <w:pPr>
+        <w:spacing w:after="40" w:before="120"/>
+      </w:pPr>
+      <w:r>
+        <w:rPr>
+          <w:rFonts w:ascii="Calibri" w:cs="Calibri" w:eastAsia="Calibri" w:hAnsi="Calibri"/>
+          <w:b/>
+          <w:bCs/>
+          <w:i/>
+          <w:iCs/>
+          <w:sz w:val="20"/>
+          <w:szCs w:val="20"/>
+        </w:rPr>
+        <w:t xml:space="preserve">Journal Papers</w:t>
+      </w:r>
+    </w:p>
+    <w:p>
+      <w:pPr>
+        <w:spacing w:after="60" w:before="60"/>
+      </w:pPr>
+      <w:r>
+        <w:rPr>
+          <w:rFonts w:ascii="Calibri" w:cs="Calibri" w:eastAsia="Calibri" w:hAnsi="Calibri"/>
+          <w:sz w:val="20"/>
+          <w:szCs w:val="20"/>
+        </w:rPr>
+        <w:t xml:space="preserve">Ema Rachmawati, </w:t>
+      </w:r>
+      <w:r>
+        <w:rPr>
+          <w:rFonts w:ascii="Calibri" w:cs="Calibri" w:eastAsia="Calibri" w:hAnsi="Calibri"/>
+          <w:b/>
+          <w:bCs/>
+          <w:sz w:val="20"/>
+          <w:szCs w:val="20"/>
+        </w:rPr>
+        <w:t xml:space="preserve">M. Rifqi Dzaky Azhad</w:t>
+      </w:r>
+      <w:r>
+        <w:rPr>
+          <w:rFonts w:ascii="Calibri" w:cs="Calibri" w:eastAsia="Calibri" w:hAnsi="Calibri"/>
+          <w:sz w:val="20"/>
+          <w:szCs w:val="20"/>
+        </w:rPr>
+        <w:t xml:space="preserve"> et al.</w:t>
+      </w:r>
+      <w:r>
+        <w:rPr>
+          <w:rFonts w:ascii="Calibri" w:cs="Calibri" w:eastAsia="Calibri" w:hAnsi="Calibri"/>
+          <w:sz w:val="20"/>
+          <w:szCs w:val="20"/>
+        </w:rPr>
+        <w:t xml:space="preserve"> (2nd author). </w:t>
+      </w:r>
+      <w:r>
+        <w:rPr>
+          <w:rFonts w:ascii="Calibri" w:cs="Calibri" w:eastAsia="Calibri" w:hAnsi="Calibri"/>
+          <w:i/>
+          <w:iCs/>
+          <w:sz w:val="20"/>
+          <w:szCs w:val="20"/>
+        </w:rPr>
+        <w:t xml:space="preserve">Deep Learning-Based Segmentation of Whole-Body Bone Scan Images Using nnU-Netv2</w:t>
+      </w:r>
+      <w:r>
+        <w:rPr>
+          <w:rFonts w:ascii="Calibri" w:cs="Calibri" w:eastAsia="Calibri" w:hAnsi="Calibri"/>
+          <w:sz w:val="20"/>
+          <w:szCs w:val="20"/>
+        </w:rPr>
+        <w:t xml:space="preserve">. International Journal of Intelligent Engineering and Systems (IJIES-INASS), 2025.</w:t>
+      </w:r>
+    </w:p>
+    <w:p>
+      <w:pPr>
+        <w:spacing w:after="40" w:before="120"/>
+      </w:pPr>
+      <w:r>
+        <w:rPr>
+          <w:rFonts w:ascii="Calibri" w:cs="Calibri" w:eastAsia="Calibri" w:hAnsi="Calibri"/>
+          <w:b/>
+          <w:bCs/>
+          <w:i/>
+          <w:iCs/>
+          <w:sz w:val="20"/>
+          <w:szCs w:val="20"/>
+        </w:rPr>
+        <w:t xml:space="preserve">Conference Papers</w:t>
+      </w:r>
+    </w:p>
+    <w:p>
+      <w:pPr>
+        <w:spacing w:after="60" w:before="60"/>
+      </w:pPr>
+      <w:r>
+        <w:rPr>
+          <w:rFonts w:ascii="Calibri" w:cs="Calibri" w:eastAsia="Calibri" w:hAnsi="Calibri"/>
+          <w:b/>
+          <w:bCs/>
+          <w:sz w:val="20"/>
+          <w:szCs w:val="20"/>
+        </w:rPr>
+        <w:t xml:space="preserve">M. Rifqi Dzaky Azhad</w:t>
+      </w:r>
+      <w:r>
+        <w:rPr>
+          <w:rFonts w:ascii="Calibri" w:cs="Calibri" w:eastAsia="Calibri" w:hAnsi="Calibri"/>
+          <w:sz w:val="20"/>
+          <w:szCs w:val="20"/>
+        </w:rPr>
+        <w:t xml:space="preserve">, Rafiq Labib, Athila Ramdani Saputra, Edward Ferdian et al.</w:t>
+      </w:r>
+      <w:r>
+        <w:rPr>
+          <w:rFonts w:ascii="Calibri" w:cs="Calibri" w:eastAsia="Calibri" w:hAnsi="Calibri"/>
+          <w:sz w:val="20"/>
+          <w:szCs w:val="20"/>
+        </w:rPr>
+        <w:t xml:space="preserve"> (1st author). </w:t>
+      </w:r>
+      <w:r>
+        <w:rPr>
+          <w:rFonts w:ascii="Calibri" w:cs="Calibri" w:eastAsia="Calibri" w:hAnsi="Calibri"/>
+          <w:i/>
+          <w:iCs/>
+          <w:sz w:val="20"/>
+          <w:szCs w:val="20"/>
+        </w:rPr>
+        <w:t xml:space="preserve">Deep Learning for Bird Identification Using Sound: Enhancing Avian Monitoring and Conservation in Indonesia and Malaysia</w:t>
+      </w:r>
+      <w:r>
+        <w:rPr>
+          <w:rFonts w:ascii="Calibri" w:cs="Calibri" w:eastAsia="Calibri" w:hAnsi="Calibri"/>
+          <w:sz w:val="20"/>
+          <w:szCs w:val="20"/>
+        </w:rPr>
+        <w:t xml:space="preserve">. ICITACEE 2025, IEEE Xplore.</w:t>
+      </w:r>
+      <w:r>
+        <w:rPr>
+          <w:rFonts w:ascii="Calibri" w:cs="Calibri" w:eastAsia="Calibri" w:hAnsi="Calibri"/>
+          <w:sz w:val="20"/>
+          <w:szCs w:val="20"/>
+        </w:rPr>
+        <w:t xml:space="preserve"> https://ieeexplore.ieee.org/document/11233192</w:t>
+      </w:r>
+    </w:p>
+    <w:p>
+      <w:pPr>
+        <w:spacing w:after="40" w:before="120"/>
+      </w:pPr>
+      <w:r>
+        <w:rPr>
+          <w:rFonts w:ascii="Calibri" w:cs="Calibri" w:eastAsia="Calibri" w:hAnsi="Calibri"/>
+          <w:b/>
+          <w:bCs/>
+          <w:i/>
+          <w:iCs/>
+          <w:sz w:val="20"/>
+          <w:szCs w:val="20"/>
+        </w:rPr>
+        <w:t xml:space="preserve">Preprints</w:t>
+      </w:r>
+    </w:p>
+    <w:p>
+      <w:pPr>
+        <w:spacing w:after="60" w:before="60"/>
+      </w:pPr>
+      <w:r>
+        <w:rPr>
+          <w:rFonts w:ascii="Calibri" w:cs="Calibri" w:eastAsia="Calibri" w:hAnsi="Calibri"/>
+          <w:sz w:val="20"/>
+          <w:szCs w:val="20"/>
+        </w:rPr>
+        <w:t xml:space="preserve">Ema Rachmawati, </w:t>
+      </w:r>
+      <w:r>
+        <w:rPr>
+          <w:rFonts w:ascii="Calibri" w:cs="Calibri" w:eastAsia="Calibri" w:hAnsi="Calibri"/>
+          <w:b/>
+          <w:bCs/>
+          <w:sz w:val="20"/>
+          <w:szCs w:val="20"/>
+        </w:rPr>
+        <w:t xml:space="preserve">M. Rifqi Dzaky Azhad</w:t>
+      </w:r>
+      <w:r>
+        <w:rPr>
+          <w:rFonts w:ascii="Calibri" w:cs="Calibri" w:eastAsia="Calibri" w:hAnsi="Calibri"/>
+          <w:sz w:val="20"/>
+          <w:szCs w:val="20"/>
+        </w:rPr>
+        <w:t xml:space="preserve">, Ida Bagus Indrabudhi Kusuma, Yolanda Rahma Chrysti, Nasywa Kamila</w:t>
+      </w:r>
+      <w:r>
+        <w:rPr>
+          <w:rFonts w:ascii="Calibri" w:cs="Calibri" w:eastAsia="Calibri" w:hAnsi="Calibri"/>
+          <w:sz w:val="20"/>
+          <w:szCs w:val="20"/>
+        </w:rPr>
+        <w:t xml:space="preserve"> (2nd author). </w:t>
+      </w:r>
+      <w:r>
+        <w:rPr>
+          <w:rFonts w:ascii="Calibri" w:cs="Calibri" w:eastAsia="Calibri" w:hAnsi="Calibri"/>
+          <w:i/>
+          <w:iCs/>
+          <w:sz w:val="20"/>
+          <w:szCs w:val="20"/>
+        </w:rPr>
+        <w:t xml:space="preserve">From Segmentation to Biomarker Quantification: A Deep Learning Framework for Metastases Detection in Bone Scans</w:t>
+      </w:r>
+      <w:r>
+        <w:rPr>
+          <w:rFonts w:ascii="Calibri" w:cs="Calibri" w:eastAsia="Calibri" w:hAnsi="Calibri"/>
+          <w:sz w:val="20"/>
+          <w:szCs w:val="20"/>
+        </w:rPr>
+        <w:t xml:space="preserve">. SSRN, 2025.</w:t>
+      </w:r>
+      <w:r>
+        <w:rPr>
+          <w:rFonts w:ascii="Calibri" w:cs="Calibri" w:eastAsia="Calibri" w:hAnsi="Calibri"/>
+          <w:sz w:val="20"/>
+          <w:szCs w:val="20"/>
+        </w:rPr>
+        <w:t xml:space="preserve"> https://ssrn.com/abstract=5187453</w:t>
+      </w:r>
+    </w:p>
+    <w:p>
+      <w:pPr>
+        <w:spacing w:after="40" w:before="120"/>
+      </w:pPr>
+      <w:r>
+        <w:rPr>
+          <w:rFonts w:ascii="Calibri" w:cs="Calibri" w:eastAsia="Calibri" w:hAnsi="Calibri"/>
+          <w:b/>
+          <w:bCs/>
+          <w:i/>
+          <w:iCs/>
+          <w:sz w:val="20"/>
+          <w:szCs w:val="20"/>
+        </w:rPr>
+        <w:t xml:space="preserve">Datasets</w:t>
+      </w:r>
+    </w:p>
+    <w:p>
+      <w:pPr>
+        <w:spacing w:after="60" w:before="60"/>
+      </w:pPr>
+      <w:r>
+        <w:rPr>
+          <w:rFonts w:ascii="Calibri" w:cs="Calibri" w:eastAsia="Calibri" w:hAnsi="Calibri"/>
+          <w:sz w:val="20"/>
+          <w:szCs w:val="20"/>
+        </w:rPr>
+        <w:t xml:space="preserve">Ema Rachmawati, </w:t>
+      </w:r>
+      <w:r>
+        <w:rPr>
+          <w:rFonts w:ascii="Calibri" w:cs="Calibri" w:eastAsia="Calibri" w:hAnsi="Calibri"/>
+          <w:b/>
+          <w:bCs/>
+          <w:sz w:val="20"/>
+          <w:szCs w:val="20"/>
+        </w:rPr>
+        <w:t xml:space="preserve">M. Rifqi Dzaky Azhad</w:t>
+      </w:r>
+      <w:r>
+        <w:rPr>
+          <w:rFonts w:ascii="Calibri" w:cs="Calibri" w:eastAsia="Calibri" w:hAnsi="Calibri"/>
+          <w:sz w:val="20"/>
+          <w:szCs w:val="20"/>
+        </w:rPr>
+        <w:t xml:space="preserve"/>
+      </w:r>
+      <w:r>
+        <w:rPr>
+          <w:rFonts w:ascii="Calibri" w:cs="Calibri" w:eastAsia="Calibri" w:hAnsi="Calibri"/>
+          <w:sz w:val="20"/>
+          <w:szCs w:val="20"/>
+        </w:rPr>
+        <w:t xml:space="preserve"> (2nd author). </w:t>
+      </w:r>
+      <w:r>
+        <w:rPr>
+          <w:rFonts w:ascii="Calibri" w:cs="Calibri" w:eastAsia="Calibri" w:hAnsi="Calibri"/>
+          <w:i/>
+          <w:iCs/>
+          <w:sz w:val="20"/>
+          <w:szCs w:val="20"/>
+        </w:rPr>
+        <w:t xml:space="preserve">Whole-Body Bone Scintigraphy Segmentation Masks: Ground-Truth Annotations for Bone Area Segmentation</w:t>
+      </w:r>
+      <w:r>
+        <w:rPr>
+          <w:rFonts w:ascii="Calibri" w:cs="Calibri" w:eastAsia="Calibri" w:hAnsi="Calibri"/>
+          <w:sz w:val="20"/>
+          <w:szCs w:val="20"/>
+        </w:rPr>
+        <w:t xml:space="preserve">. Zenodo, 2025.</w:t>
+      </w:r>
+      <w:r>
+        <w:rPr>
+          <w:rFonts w:ascii="Calibri" w:cs="Calibri" w:eastAsia="Calibri" w:hAnsi="Calibri"/>
+          <w:sz w:val="20"/>
+          <w:szCs w:val="20"/>
+        </w:rPr>
+        <w:t xml:space="preserve"> https://zenodo.org/records/20342310</w:t>
+      </w:r>
+    </w:p>
+    <w:p>
+      <w:pPr>
+        <w:pBdr>
+          <w:bottom w:val="single" w:color="000000" w:sz="4" w:space="2"/>
+        </w:pBdr>
+        <w:spacing w:after="80" w:before="200"/>
+      </w:pPr>
+      <w:r>
+        <w:rPr>
+          <w:rFonts w:ascii="Calibri" w:cs="Calibri" w:eastAsia="Calibri" w:hAnsi="Calibri"/>
+          <w:b/>
+          <w:bCs/>
+          <w:caps/>
+          <w:sz w:val="22"/>
+          <w:szCs w:val="22"/>
+        </w:rPr>
+        <w:t xml:space="preserve">Selected Projects</w:t>
       </w:r>
     </w:p>
     <w:p>
@@ -1063,15 +1430,15 @@
           <w:sz w:val="20"/>
           <w:szCs w:val="20"/>
         </w:rPr>
-        <w:t xml:space="preserve">Paper Reviewer and Room Coordinator</w:t>
-      </w:r>
-      <w:r>
-        <w:rPr>
-          <w:rFonts w:ascii="Calibri" w:cs="Calibri" w:eastAsia="Calibri" w:hAnsi="Calibri"/>
-          <w:sz w:val="20"/>
-          <w:szCs w:val="20"/>
-        </w:rPr>
-        <w:t xml:space="preserve">	August 2024 – September 2024</w:t>
+        <w:t xml:space="preserve">Bone Metastasis Diagnosis Framework</w:t>
+      </w:r>
+      <w:r>
+        <w:rPr>
+          <w:rFonts w:ascii="Calibri" w:cs="Calibri" w:eastAsia="Calibri" w:hAnsi="Calibri"/>
+          <w:sz w:val="20"/>
+          <w:szCs w:val="20"/>
+        </w:rPr>
+        <w:t xml:space="preserve">	August 2024 – February 2025</w:t>
       </w:r>
     </w:p>
     <w:p>
@@ -1086,250 +1453,41 @@
           <w:sz w:val="20"/>
           <w:szCs w:val="20"/>
         </w:rPr>
-        <w:t xml:space="preserve">ICoICT 2024</w:t>
-      </w:r>
-    </w:p>
-    <w:p>
-      <w:pPr>
-        <w:pStyle w:val="ListParagraph"/>
-        <w:numPr>
-          <w:ilvl w:val="0"/>
-          <w:numId w:val="2"/>
-        </w:numPr>
-      </w:pPr>
-      <w:r>
-        <w:rPr>
-          <w:rFonts w:ascii="Calibri" w:cs="Calibri" w:eastAsia="Calibri" w:hAnsi="Calibri"/>
-          <w:sz w:val="20"/>
-          <w:szCs w:val="20"/>
-        </w:rPr>
-        <w:t xml:space="preserve">Reviewed 4 conference papers and returned corrections ahead of deadline. Managed AV for 4 sessions, assisted 22 presenters.</w:t>
-      </w:r>
-    </w:p>
-    <w:p>
-      <w:pPr>
-        <w:pBdr>
-          <w:bottom w:val="single" w:color="000000" w:sz="4" w:space="2"/>
-        </w:pBdr>
-        <w:spacing w:after="80" w:before="180"/>
-      </w:pPr>
-      <w:r>
-        <w:rPr>
-          <w:rFonts w:ascii="Calibri" w:cs="Calibri" w:eastAsia="Calibri" w:hAnsi="Calibri"/>
-          <w:b/>
-          <w:bCs/>
-          <w:caps/>
-          <w:sz w:val="22"/>
-          <w:szCs w:val="22"/>
-        </w:rPr>
-        <w:t xml:space="preserve">Publications</w:t>
-      </w:r>
-    </w:p>
-    <w:p>
-      <w:pPr>
-        <w:spacing w:after="60" w:before="60"/>
-      </w:pPr>
-      <w:r>
-        <w:rPr>
-          <w:rFonts w:ascii="Calibri" w:cs="Calibri" w:eastAsia="Calibri" w:hAnsi="Calibri"/>
-          <w:b/>
-          <w:bCs/>
-          <w:sz w:val="20"/>
-          <w:szCs w:val="20"/>
-        </w:rPr>
-        <w:t xml:space="preserve">[Journal Paper]  </w:t>
-      </w:r>
-      <w:r>
-        <w:rPr>
-          <w:rFonts w:ascii="Calibri" w:cs="Calibri" w:eastAsia="Calibri" w:hAnsi="Calibri"/>
-          <w:sz w:val="20"/>
-          <w:szCs w:val="20"/>
-        </w:rPr>
-        <w:t xml:space="preserve">Ema Rachmawati, M. Rifqi Dzaky Azhad et al. (2nd author).  </w:t>
-      </w:r>
-      <w:r>
-        <w:rPr>
-          <w:rFonts w:ascii="Calibri" w:cs="Calibri" w:eastAsia="Calibri" w:hAnsi="Calibri"/>
-          <w:i/>
-          <w:iCs/>
-          <w:sz w:val="20"/>
-          <w:szCs w:val="20"/>
-        </w:rPr>
-        <w:t xml:space="preserve">Deep Learning-Based Segmentation of Whole-Body Bone Scan Images Using nnU-Netv2</w:t>
-      </w:r>
-      <w:r>
-        <w:rPr>
-          <w:rFonts w:ascii="Calibri" w:cs="Calibri" w:eastAsia="Calibri" w:hAnsi="Calibri"/>
-          <w:sz w:val="20"/>
-          <w:szCs w:val="20"/>
-        </w:rPr>
-        <w:t xml:space="preserve">.  International Journal of Intelligent Engineering and Systems (IJIES-INASS), 2025.</w:t>
-      </w:r>
-    </w:p>
-    <w:p>
-      <w:pPr>
-        <w:spacing w:after="60" w:before="60"/>
-      </w:pPr>
-      <w:r>
-        <w:rPr>
-          <w:rFonts w:ascii="Calibri" w:cs="Calibri" w:eastAsia="Calibri" w:hAnsi="Calibri"/>
-          <w:b/>
-          <w:bCs/>
-          <w:sz w:val="20"/>
-          <w:szCs w:val="20"/>
-        </w:rPr>
-        <w:t xml:space="preserve">[Conference Paper]  </w:t>
-      </w:r>
-      <w:r>
-        <w:rPr>
-          <w:rFonts w:ascii="Calibri" w:cs="Calibri" w:eastAsia="Calibri" w:hAnsi="Calibri"/>
-          <w:sz w:val="20"/>
-          <w:szCs w:val="20"/>
-        </w:rPr>
-        <w:t xml:space="preserve">M. Rifqi Dzaky Azhad, Rafiq Labib, Athila Ramdani Saputra, Edward Ferdian et al. (1st author).  </w:t>
-      </w:r>
-      <w:r>
-        <w:rPr>
-          <w:rFonts w:ascii="Calibri" w:cs="Calibri" w:eastAsia="Calibri" w:hAnsi="Calibri"/>
-          <w:i/>
-          <w:iCs/>
-          <w:sz w:val="20"/>
-          <w:szCs w:val="20"/>
-        </w:rPr>
-        <w:t xml:space="preserve">Deep Learning for Bird Identification Using Sound: Enhancing Avian Monitoring and Conservation in Indonesia and Malaysia</w:t>
-      </w:r>
-      <w:r>
-        <w:rPr>
-          <w:rFonts w:ascii="Calibri" w:cs="Calibri" w:eastAsia="Calibri" w:hAnsi="Calibri"/>
-          <w:sz w:val="20"/>
-          <w:szCs w:val="20"/>
-        </w:rPr>
-        <w:t xml:space="preserve">.  ICITACEE 2025, indexed IEEE Xplore.</w:t>
-      </w:r>
-      <w:r>
-        <w:rPr>
-          <w:rFonts w:ascii="Calibri" w:cs="Calibri" w:eastAsia="Calibri" w:hAnsi="Calibri"/>
-          <w:sz w:val="20"/>
-          <w:szCs w:val="20"/>
-        </w:rPr>
-        <w:t xml:space="preserve">  https://ieeexplore.ieee.org/document/11233192</w:t>
-      </w:r>
-    </w:p>
-    <w:p>
-      <w:pPr>
-        <w:spacing w:after="60" w:before="60"/>
-      </w:pPr>
-      <w:r>
-        <w:rPr>
-          <w:rFonts w:ascii="Calibri" w:cs="Calibri" w:eastAsia="Calibri" w:hAnsi="Calibri"/>
-          <w:b/>
-          <w:bCs/>
-          <w:sz w:val="20"/>
-          <w:szCs w:val="20"/>
-        </w:rPr>
-        <w:t xml:space="preserve">[Preprint (under review)]  </w:t>
-      </w:r>
-      <w:r>
-        <w:rPr>
-          <w:rFonts w:ascii="Calibri" w:cs="Calibri" w:eastAsia="Calibri" w:hAnsi="Calibri"/>
-          <w:sz w:val="20"/>
-          <w:szCs w:val="20"/>
-        </w:rPr>
-        <w:t xml:space="preserve">Ema Rachmawati, M. Rifqi Dzaky Azhad et al. (2nd author).  </w:t>
-      </w:r>
-      <w:r>
-        <w:rPr>
-          <w:rFonts w:ascii="Calibri" w:cs="Calibri" w:eastAsia="Calibri" w:hAnsi="Calibri"/>
-          <w:i/>
-          <w:iCs/>
-          <w:sz w:val="20"/>
-          <w:szCs w:val="20"/>
-        </w:rPr>
-        <w:t xml:space="preserve">From Segmentation to Biomarker Quantification: A Deep Learning Framework for Metastases Detection in Bone Scans</w:t>
-      </w:r>
-      <w:r>
-        <w:rPr>
-          <w:rFonts w:ascii="Calibri" w:cs="Calibri" w:eastAsia="Calibri" w:hAnsi="Calibri"/>
-          <w:sz w:val="20"/>
-          <w:szCs w:val="20"/>
-        </w:rPr>
-        <w:t xml:space="preserve">.  SSRN, 2025.</w:t>
-      </w:r>
-      <w:r>
-        <w:rPr>
-          <w:rFonts w:ascii="Calibri" w:cs="Calibri" w:eastAsia="Calibri" w:hAnsi="Calibri"/>
-          <w:sz w:val="20"/>
-          <w:szCs w:val="20"/>
-        </w:rPr>
-        <w:t xml:space="preserve">  https://ssrn.com/abstract=5187453</w:t>
-      </w:r>
-    </w:p>
-    <w:p>
-      <w:pPr>
-        <w:spacing w:after="60" w:before="60"/>
-      </w:pPr>
-      <w:r>
-        <w:rPr>
-          <w:rFonts w:ascii="Calibri" w:cs="Calibri" w:eastAsia="Calibri" w:hAnsi="Calibri"/>
-          <w:b/>
-          <w:bCs/>
-          <w:sz w:val="20"/>
-          <w:szCs w:val="20"/>
-        </w:rPr>
-        <w:t xml:space="preserve">[Dataset]  </w:t>
-      </w:r>
-      <w:r>
-        <w:rPr>
-          <w:rFonts w:ascii="Calibri" w:cs="Calibri" w:eastAsia="Calibri" w:hAnsi="Calibri"/>
-          <w:sz w:val="20"/>
-          <w:szCs w:val="20"/>
-        </w:rPr>
-        <w:t xml:space="preserve">Ema Rachmawati, M. Rifqi Dzaky Azhad (2nd author).  </w:t>
-      </w:r>
-      <w:r>
-        <w:rPr>
-          <w:rFonts w:ascii="Calibri" w:cs="Calibri" w:eastAsia="Calibri" w:hAnsi="Calibri"/>
-          <w:i/>
-          <w:iCs/>
-          <w:sz w:val="20"/>
-          <w:szCs w:val="20"/>
-        </w:rPr>
-        <w:t xml:space="preserve">Whole-Body Bone Scintigraphy Segmentation Masks: Ground-Truth Annotations for Bone Area Segmentation</w:t>
-      </w:r>
-      <w:r>
-        <w:rPr>
-          <w:rFonts w:ascii="Calibri" w:cs="Calibri" w:eastAsia="Calibri" w:hAnsi="Calibri"/>
-          <w:sz w:val="20"/>
-          <w:szCs w:val="20"/>
-        </w:rPr>
-        <w:t xml:space="preserve">.  Zenodo, 2025.</w:t>
-      </w:r>
-      <w:r>
-        <w:rPr>
-          <w:rFonts w:ascii="Calibri" w:cs="Calibri" w:eastAsia="Calibri" w:hAnsi="Calibri"/>
-          <w:sz w:val="20"/>
-          <w:szCs w:val="20"/>
-        </w:rPr>
-        <w:t xml:space="preserve">  https://zenodo.org/records/20342310</w:t>
-      </w:r>
-    </w:p>
-    <w:p>
-      <w:pPr>
-        <w:pBdr>
-          <w:bottom w:val="single" w:color="000000" w:sz="4" w:space="2"/>
-        </w:pBdr>
-        <w:spacing w:after="80" w:before="180"/>
-      </w:pPr>
-      <w:r>
-        <w:rPr>
-          <w:rFonts w:ascii="Calibri" w:cs="Calibri" w:eastAsia="Calibri" w:hAnsi="Calibri"/>
-          <w:b/>
-          <w:bCs/>
-          <w:caps/>
-          <w:sz w:val="22"/>
-          <w:szCs w:val="22"/>
-        </w:rPr>
-        <w:t xml:space="preserve">Selected Projects</w:t>
+        <w:t xml:space="preserve">Lead Coder · Ministry of Higher Education RI</w:t>
+      </w:r>
+    </w:p>
+    <w:p>
+      <w:pPr>
+        <w:pStyle w:val="ListParagraph"/>
+        <w:numPr>
+          <w:ilvl w:val="0"/>
+          <w:numId w:val="2"/>
+        </w:numPr>
+      </w:pPr>
+      <w:r>
+        <w:rPr>
+          <w:rFonts w:ascii="Calibri" w:cs="Calibri" w:eastAsia="Calibri" w:hAnsi="Calibri"/>
+          <w:sz w:val="20"/>
+          <w:szCs w:val="20"/>
+        </w:rPr>
+        <w:t xml:space="preserve">Hotspot detection with YOLOv8: mAP@0.5 = 0.599. Skeletal segmentation with nnU-Net v2 across 12 anatomical regions: IoU 0.879.</w:t>
+      </w:r>
+    </w:p>
+    <w:p>
+      <w:pPr>
+        <w:pStyle w:val="ListParagraph"/>
+        <w:numPr>
+          <w:ilvl w:val="0"/>
+          <w:numId w:val="2"/>
+        </w:numPr>
+      </w:pPr>
+      <w:r>
+        <w:rPr>
+          <w:rFonts w:ascii="Calibri" w:cs="Calibri" w:eastAsia="Calibri" w:hAnsi="Calibri"/>
+          <w:sz w:val="20"/>
+          <w:szCs w:val="20"/>
+        </w:rPr>
+        <w:t xml:space="preserve">Patient-level AUC 0.956 with XGBoost and LightGBM, surpassing EXINI (0.83–0.88) and BONENAVI (0.84–0.89), both in clinical use at the time.</w:t>
       </w:r>
     </w:p>
     <w:p>
@@ -1347,15 +1505,15 @@
           <w:sz w:val="20"/>
           <w:szCs w:val="20"/>
         </w:rPr>
-        <w:t xml:space="preserve">Bone Metastasis Diagnosis Framework</w:t>
-      </w:r>
-      <w:r>
-        <w:rPr>
-          <w:rFonts w:ascii="Calibri" w:cs="Calibri" w:eastAsia="Calibri" w:hAnsi="Calibri"/>
-          <w:sz w:val="20"/>
-          <w:szCs w:val="20"/>
-        </w:rPr>
-        <w:t xml:space="preserve">	August 2024 – February 2025</w:t>
+        <w:t xml:space="preserve">Deep Learning for Bird Sound Identification</w:t>
+      </w:r>
+      <w:r>
+        <w:rPr>
+          <w:rFonts w:ascii="Calibri" w:cs="Calibri" w:eastAsia="Calibri" w:hAnsi="Calibri"/>
+          <w:sz w:val="20"/>
+          <w:szCs w:val="20"/>
+        </w:rPr>
+        <w:t xml:space="preserve">	November 2024 – August 2025</w:t>
       </w:r>
     </w:p>
     <w:p>
@@ -1370,41 +1528,41 @@
           <w:sz w:val="20"/>
           <w:szCs w:val="20"/>
         </w:rPr>
-        <w:t xml:space="preserve">Lead Coder · Ministry of Higher Education RI</w:t>
-      </w:r>
-    </w:p>
-    <w:p>
-      <w:pPr>
-        <w:pStyle w:val="ListParagraph"/>
-        <w:numPr>
-          <w:ilvl w:val="0"/>
-          <w:numId w:val="2"/>
-        </w:numPr>
-      </w:pPr>
-      <w:r>
-        <w:rPr>
-          <w:rFonts w:ascii="Calibri" w:cs="Calibri" w:eastAsia="Calibri" w:hAnsi="Calibri"/>
-          <w:sz w:val="20"/>
-          <w:szCs w:val="20"/>
-        </w:rPr>
-        <w:t xml:space="preserve">Hotspot detection with YOLOv8: mAP@0.5 = 0.599. Skeletal segmentation with nnU-Net v2 across 12 anatomical regions: IoU 0.879.</w:t>
-      </w:r>
-    </w:p>
-    <w:p>
-      <w:pPr>
-        <w:pStyle w:val="ListParagraph"/>
-        <w:numPr>
-          <w:ilvl w:val="0"/>
-          <w:numId w:val="2"/>
-        </w:numPr>
-      </w:pPr>
-      <w:r>
-        <w:rPr>
-          <w:rFonts w:ascii="Calibri" w:cs="Calibri" w:eastAsia="Calibri" w:hAnsi="Calibri"/>
-          <w:sz w:val="20"/>
-          <w:szCs w:val="20"/>
-        </w:rPr>
-        <w:t xml:space="preserve">Patient-level AUC 0.956 with XGBoost and LightGBM, surpassing EXINI (0.83–0.88) and BONENAVI (0.84–0.89), both commercial systems in clinical use at the time.</w:t>
+        <w:t xml:space="preserve">Research Lead · Telkom University · Universiti Malaysia Sarawak</w:t>
+      </w:r>
+    </w:p>
+    <w:p>
+      <w:pPr>
+        <w:pStyle w:val="ListParagraph"/>
+        <w:numPr>
+          <w:ilvl w:val="0"/>
+          <w:numId w:val="2"/>
+        </w:numPr>
+      </w:pPr>
+      <w:r>
+        <w:rPr>
+          <w:rFonts w:ascii="Calibri" w:cs="Calibri" w:eastAsia="Calibri" w:hAnsi="Calibri"/>
+          <w:sz w:val="20"/>
+          <w:szCs w:val="20"/>
+        </w:rPr>
+        <w:t xml:space="preserve">Fine-tuned BirdNET v2.4 with MixIT source separation on 12,511 recordings across 219 endemic and endangered species in Indonesia, Malaysia, and Borneo.</w:t>
+      </w:r>
+    </w:p>
+    <w:p>
+      <w:pPr>
+        <w:pStyle w:val="ListParagraph"/>
+        <w:numPr>
+          <w:ilvl w:val="0"/>
+          <w:numId w:val="2"/>
+        </w:numPr>
+      </w:pPr>
+      <w:r>
+        <w:rPr>
+          <w:rFonts w:ascii="Calibri" w:cs="Calibri" w:eastAsia="Calibri" w:hAnsi="Calibri"/>
+          <w:sz w:val="20"/>
+          <w:szCs w:val="20"/>
+        </w:rPr>
+        <w:t xml:space="preserve">Macro F1 improved 44.1% over baseline. Field-validated at Bandung Zoo and Malaysia National Zoo under uncontrolled conditions.</w:t>
       </w:r>
     </w:p>
     <w:p>
@@ -1462,7 +1620,7 @@
           <w:sz w:val="20"/>
           <w:szCs w:val="20"/>
         </w:rPr>
-        <w:t xml:space="preserve">Macro F1 0.78 on real mining fleet dashcam footage, 11% above the company’s existing production model.</w:t>
+        <w:t xml:space="preserve">Macro F1 0.78 on real mining fleet dashcam footage, 11% above the company's existing production model.</w:t>
       </w:r>
     </w:p>
     <w:p>
@@ -1629,7 +1787,7 @@
           <w:sz w:val="20"/>
           <w:szCs w:val="20"/>
         </w:rPr>
-        <w:t xml:space="preserve">Both modules deployed as microservices for the team’s web app and desktop app through shared API endpoints.</w:t>
+        <w:t xml:space="preserve">Both modules deployed as microservices for the team's web app and desktop app through shared API endpoints.</w:t>
       </w:r>
     </w:p>
     <w:p>
@@ -1637,7 +1795,7 @@
         <w:pBdr>
           <w:bottom w:val="single" w:color="000000" w:sz="4" w:space="2"/>
         </w:pBdr>
-        <w:spacing w:after="80" w:before="180"/>
+        <w:spacing w:after="80" w:before="200"/>
       </w:pPr>
       <w:r>
         <w:rPr>
@@ -1663,15 +1821,15 @@
           <w:sz w:val="20"/>
           <w:szCs w:val="20"/>
         </w:rPr>
-        <w:t xml:space="preserve">Best Paper Award.  </w:t>
-      </w:r>
-      <w:r>
-        <w:rPr>
-          <w:rFonts w:ascii="Calibri" w:cs="Calibri" w:eastAsia="Calibri" w:hAnsi="Calibri"/>
-          <w:sz w:val="20"/>
-          <w:szCs w:val="20"/>
-        </w:rPr>
-        <w:t xml:space="preserve">ADIKARA 2025, School of Computing, Telkom University.  Diabetic mellitus detection from retina fundus images. Led a team of 3.</w:t>
+        <w:t xml:space="preserve">Best Paper Award. </w:t>
+      </w:r>
+      <w:r>
+        <w:rPr>
+          <w:rFonts w:ascii="Calibri" w:cs="Calibri" w:eastAsia="Calibri" w:hAnsi="Calibri"/>
+          <w:sz w:val="20"/>
+          <w:szCs w:val="20"/>
+        </w:rPr>
+        <w:t xml:space="preserve">ADIKARA 2025, School of Computing, Telkom University. Diabetic mellitus detection from retina fundus images. Team lead.</w:t>
       </w:r>
     </w:p>
     <w:p>
@@ -1686,15 +1844,15 @@
           <w:sz w:val="20"/>
           <w:szCs w:val="20"/>
         </w:rPr>
-        <w:t xml:space="preserve">Best Proposal Honorable Mention.  </w:t>
-      </w:r>
-      <w:r>
-        <w:rPr>
-          <w:rFonts w:ascii="Calibri" w:cs="Calibri" w:eastAsia="Calibri" w:hAnsi="Calibri"/>
-          <w:sz w:val="20"/>
-          <w:szCs w:val="20"/>
-        </w:rPr>
-        <w:t xml:space="preserve">ADIKARA 2024, School of Computing, Telkom University.  Non-invasive diabetes mellitus detection from tongue images using MobileNet and ViT.</w:t>
+        <w:t xml:space="preserve">Best Proposal Honorable Mention. </w:t>
+      </w:r>
+      <w:r>
+        <w:rPr>
+          <w:rFonts w:ascii="Calibri" w:cs="Calibri" w:eastAsia="Calibri" w:hAnsi="Calibri"/>
+          <w:sz w:val="20"/>
+          <w:szCs w:val="20"/>
+        </w:rPr>
+        <w:t xml:space="preserve">ADIKARA 2024, School of Computing, Telkom University. Non-invasive diabetes mellitus detection from tongue images using MobileNet and ViT.</w:t>
       </w:r>
     </w:p>
     <w:p>
@@ -1709,7 +1867,7 @@
           <w:sz w:val="20"/>
           <w:szCs w:val="20"/>
         </w:rPr>
-        <w:t xml:space="preserve">National Qualifier, D3/D4/S1 Category.  </w:t>
+        <w:t xml:space="preserve">National Qualifier, D3/D4/S1 Category. </w:t>
       </w:r>
       <w:r>
         <w:rPr>
@@ -1732,7 +1890,7 @@
           <w:sz w:val="20"/>
           <w:szCs w:val="20"/>
         </w:rPr>
-        <w:t xml:space="preserve">Top 25.  </w:t>
+        <w:t xml:space="preserve">Top 25. </w:t>
       </w:r>
       <w:r>
         <w:rPr>
@@ -1755,7 +1913,7 @@
           <w:sz w:val="20"/>
           <w:szCs w:val="20"/>
         </w:rPr>
-        <w:t xml:space="preserve">3rd Place.  </w:t>
+        <w:t xml:space="preserve">3rd Place. </w:t>
       </w:r>
       <w:r>
         <w:rPr>
@@ -1771,7 +1929,7 @@
         <w:pBdr>
           <w:bottom w:val="single" w:color="000000" w:sz="4" w:space="2"/>
         </w:pBdr>
-        <w:spacing w:after="80" w:before="180"/>
+        <w:spacing w:after="80" w:before="200"/>
       </w:pPr>
       <w:r>
         <w:rPr>
@@ -1820,7 +1978,7 @@
           <w:sz w:val="20"/>
           <w:szCs w:val="20"/>
         </w:rPr>
-        <w:t xml:space="preserve">Vision and Audio: </w:t>
+        <w:t xml:space="preserve">Computer Vision and Audio: </w:t>
       </w:r>
       <w:r>
         <w:rPr>
@@ -1905,7 +2063,7 @@
         <w:pBdr>
           <w:bottom w:val="single" w:color="000000" w:sz="4" w:space="2"/>
         </w:pBdr>
-        <w:spacing w:after="80" w:before="180"/>
+        <w:spacing w:after="80" w:before="200"/>
       </w:pPr>
       <w:r>
         <w:rPr>
@@ -1916,7 +2074,33 @@
           <w:sz w:val="22"/>
           <w:szCs w:val="22"/>
         </w:rPr>
-        <w:t xml:space="preserve">Languages</w:t>
+        <w:t xml:space="preserve">Education</w:t>
+      </w:r>
+    </w:p>
+    <w:p>
+      <w:pPr>
+        <w:tabs>
+          <w:tab w:val="right" w:pos="9746"/>
+        </w:tabs>
+        <w:spacing w:after="0" w:before="120"/>
+      </w:pPr>
+      <w:r>
+        <w:rPr>
+          <w:rFonts w:ascii="Calibri" w:cs="Calibri" w:eastAsia="Calibri" w:hAnsi="Calibri"/>
+          <w:b/>
+          <w:bCs/>
+          <w:sz w:val="20"/>
+          <w:szCs w:val="20"/>
+        </w:rPr>
+        <w:t xml:space="preserve">S1 Informatika (Bachelor of Informatics)</w:t>
+      </w:r>
+      <w:r>
+        <w:rPr>
+          <w:rFonts w:ascii="Calibri" w:cs="Calibri" w:eastAsia="Calibri" w:hAnsi="Calibri"/>
+          <w:sz w:val="20"/>
+          <w:szCs w:val="20"/>
+        </w:rPr>
+        <w:t xml:space="preserve">	May 2023 – Expected May 2027</w:t>
       </w:r>
     </w:p>
     <w:p>
@@ -1929,46 +2113,7 @@
           <w:sz w:val="20"/>
           <w:szCs w:val="20"/>
         </w:rPr>
-        <w:t xml:space="preserve">English – Professional working proficiency</w:t>
-      </w:r>
-    </w:p>
-    <w:p>
-      <w:pPr>
-        <w:spacing w:after="20" w:before="0"/>
-      </w:pPr>
-      <w:r>
-        <w:rPr>
-          <w:rFonts w:ascii="Calibri" w:cs="Calibri" w:eastAsia="Calibri" w:hAnsi="Calibri"/>
-          <w:sz w:val="18"/>
-          <w:szCs w:val="18"/>
-        </w:rPr>
-        <w:t xml:space="preserve">ECCT: 3.75/4.0  ·  Telkom University Language Center, February 2024</w:t>
-      </w:r>
-    </w:p>
-    <w:p>
-      <w:pPr>
-        <w:spacing w:after="60" w:before="0"/>
-      </w:pPr>
-      <w:r>
-        <w:rPr>
-          <w:rFonts w:ascii="Calibri" w:cs="Calibri" w:eastAsia="Calibri" w:hAnsi="Calibri"/>
-          <w:sz w:val="18"/>
-          <w:szCs w:val="18"/>
-        </w:rPr>
-        <w:t xml:space="preserve">EPrT: 577/677  ·  Telkom University Language Center, August 2023</w:t>
-      </w:r>
-    </w:p>
-    <w:p>
-      <w:pPr>
-        <w:spacing w:after="60" w:before="0"/>
-      </w:pPr>
-      <w:r>
-        <w:rPr>
-          <w:rFonts w:ascii="Calibri" w:cs="Calibri" w:eastAsia="Calibri" w:hAnsi="Calibri"/>
-          <w:sz w:val="20"/>
-          <w:szCs w:val="20"/>
-        </w:rPr>
-        <w:t xml:space="preserve">Indonesian – Native</w:t>
+        <w:t xml:space="preserve">Telkom University  ·  GPA 4.0/4.0</w:t>
       </w:r>
     </w:p>
     <w:p>
@@ -1976,7 +2121,78 @@
         <w:pBdr>
           <w:bottom w:val="single" w:color="000000" w:sz="4" w:space="2"/>
         </w:pBdr>
-        <w:spacing w:after="80" w:before="180"/>
+        <w:spacing w:after="80" w:before="200"/>
+      </w:pPr>
+      <w:r>
+        <w:rPr>
+          <w:rFonts w:ascii="Calibri" w:cs="Calibri" w:eastAsia="Calibri" w:hAnsi="Calibri"/>
+          <w:b/>
+          <w:bCs/>
+          <w:caps/>
+          <w:sz w:val="22"/>
+          <w:szCs w:val="22"/>
+        </w:rPr>
+        <w:t xml:space="preserve">Languages</w:t>
+      </w:r>
+    </w:p>
+    <w:p>
+      <w:pPr>
+        <w:spacing w:after="60" w:before="0"/>
+      </w:pPr>
+      <w:r>
+        <w:rPr>
+          <w:rFonts w:ascii="Calibri" w:cs="Calibri" w:eastAsia="Calibri" w:hAnsi="Calibri"/>
+          <w:sz w:val="20"/>
+          <w:szCs w:val="20"/>
+        </w:rPr>
+        <w:t xml:space="preserve">English – Professional working proficiency</w:t>
+      </w:r>
+    </w:p>
+    <w:p>
+      <w:pPr>
+        <w:spacing w:after="20" w:before="0"/>
+      </w:pPr>
+      <w:r>
+        <w:rPr>
+          <w:rFonts w:ascii="Calibri" w:cs="Calibri" w:eastAsia="Calibri" w:hAnsi="Calibri"/>
+          <w:sz w:val="18"/>
+          <w:szCs w:val="18"/>
+        </w:rPr>
+        <w:t xml:space="preserve">ECCT: 3.75/4.0  ·  Telkom University Language Center, February 2024</w:t>
+      </w:r>
+    </w:p>
+    <w:p>
+      <w:pPr>
+        <w:spacing w:after="60" w:before="0"/>
+      </w:pPr>
+      <w:r>
+        <w:rPr>
+          <w:rFonts w:ascii="Calibri" w:cs="Calibri" w:eastAsia="Calibri" w:hAnsi="Calibri"/>
+          <w:sz w:val="18"/>
+          <w:szCs w:val="18"/>
+        </w:rPr>
+        <w:t xml:space="preserve">EPrT: 577/677  ·  Telkom University Language Center, August 2023</w:t>
+      </w:r>
+    </w:p>
+    <w:p>
+      <w:pPr>
+        <w:spacing w:after="60" w:before="0"/>
+      </w:pPr>
+      <w:r>
+        <w:rPr>
+          <w:rFonts w:ascii="Calibri" w:cs="Calibri" w:eastAsia="Calibri" w:hAnsi="Calibri"/>
+          <w:sz w:val="20"/>
+          <w:szCs w:val="20"/>
+        </w:rPr>
+        <w:t xml:space="preserve">Indonesian – Native</w:t>
+      </w:r>
+    </w:p>
+    <w:p>
+      <w:pPr>
+        <w:pBdr>
+          <w:bottom w:val="single" w:color="000000" w:sz="4" w:space="2"/>
+        </w:pBdr>
+        <w:spacing w:after="80" w:before="200"/>
       </w:pPr>
       <w:r>
         <w:rPr>

</xml_diff>